<commit_message>
Completar benchmark de CPU, agregar graficos al reporte y ajustar Terraform AWS
- Fase 4: mide CPU promedio por contenedor con muestreo continuo
  (docker stats --no-stream cada ~1-2s durante toda la ventana de carga),
  reemplazando el snapshot puntual que antes se documentaba como no
  confiable. analyze_overhead.py ahora calcula esa tabla automaticamente.
- Reporte tecnico: agrega 5 graficos (arquitectura, latencia, throughput,
  memoria, CPU) en docs/charts/, referenciados desde reporte-tecnico.md y
  embebidos en el .docx (generate-report-docx.py extendido para reconocer
  docs/charts/ ademas de docs/screenshots/).
- iac/terraform/aws: corrige un bug real (faltaban las env vars AWS_REGION/
  ENVIRONMENT/TEMPO_ENDPOINT que collector-config.aws.yaml necesita) y
  agrega Postgres como tercer servicio Fargate, ya que el modulo no
  provisionaba base de datos. terraform validate: OK.
</commit_message>
<xml_diff>
--- a/docs/reporte-tecnico.docx
+++ b/docs/reporte-tecnico.docx
@@ -199,6 +199,71 @@
         <w:t xml:space="preserve">                              (dashboard 6 paneles + Explore</w:t>
         <w:br/>
         <w:t xml:space="preserve">                               correlación trace_id ↔ logs ↔ métricas)</w:t>
+      </w:r>
+    </w:p>
+    <w:p>
+      <w:r>
+        <w:t xml:space="preserve">Versión visual del mismo flujo — ver gráfico </w:t>
+      </w:r>
+      <w:r>
+        <w:rPr>
+          <w:rFonts w:ascii="Consolas" w:hAnsi="Consolas"/>
+          <w:i/>
+          <w:color w:val="2E5B9E"/>
+        </w:rPr>
+        <w:t>docs/charts/04_diagrama_arquitectura.png</w:t>
+      </w:r>
+      <w:r>
+        <w:t>.</w:t>
+      </w:r>
+    </w:p>
+    <w:p>
+      <w:r>
+        <w:drawing>
+          <wp:inline xmlns:a="http://schemas.openxmlformats.org/drawingml/2006/main" xmlns:pic="http://schemas.openxmlformats.org/drawingml/2006/picture">
+            <wp:extent cx="5760000" cy="3896471"/>
+            <wp:docPr id="1" name="Picture 1"/>
+            <wp:cNvGraphicFramePr>
+              <a:graphicFrameLocks noChangeAspect="1"/>
+            </wp:cNvGraphicFramePr>
+            <a:graphic>
+              <a:graphicData uri="http://schemas.openxmlformats.org/drawingml/2006/picture">
+                <pic:pic>
+                  <pic:nvPicPr>
+                    <pic:cNvPr id="0" name="04_diagrama_arquitectura.png"/>
+                    <pic:cNvPicPr/>
+                  </pic:nvPicPr>
+                  <pic:blipFill>
+                    <a:blip r:embed="rId9"/>
+                    <a:stretch>
+                      <a:fillRect/>
+                    </a:stretch>
+                  </pic:blipFill>
+                  <pic:spPr>
+                    <a:xfrm>
+                      <a:off x="0" y="0"/>
+                      <a:ext cx="5760000" cy="3896471"/>
+                    </a:xfrm>
+                    <a:prstGeom prst="rect"/>
+                  </pic:spPr>
+                </pic:pic>
+              </a:graphicData>
+            </a:graphic>
+          </wp:inline>
+        </w:drawing>
+      </w:r>
+    </w:p>
+    <w:p>
+      <w:pPr>
+        <w:jc w:val="center"/>
+      </w:pPr>
+      <w:r>
+        <w:rPr>
+          <w:i/>
+          <w:color w:val="606060"/>
+          <w:sz w:val="18"/>
+        </w:rPr>
+        <w:t>04_diagrama_arquitectura.png</w:t>
       </w:r>
     </w:p>
     <w:p>
@@ -1908,7 +1973,7 @@
         <w:drawing>
           <wp:inline xmlns:a="http://schemas.openxmlformats.org/drawingml/2006/main" xmlns:pic="http://schemas.openxmlformats.org/drawingml/2006/picture">
             <wp:extent cx="5760000" cy="3600000"/>
-            <wp:docPr id="1" name="Picture 1"/>
+            <wp:docPr id="2" name="Picture 2"/>
             <wp:cNvGraphicFramePr>
               <a:graphicFrameLocks noChangeAspect="1"/>
             </wp:cNvGraphicFramePr>
@@ -1917,250 +1982,6 @@
                 <pic:pic>
                   <pic:nvPicPr>
                     <pic:cNvPr id="0" name="01-jaeger-trace-service-a-service-b.png"/>
-                    <pic:cNvPicPr/>
-                  </pic:nvPicPr>
-                  <pic:blipFill>
-                    <a:blip r:embed="rId9"/>
-                    <a:stretch>
-                      <a:fillRect/>
-                    </a:stretch>
-                  </pic:blipFill>
-                  <pic:spPr>
-                    <a:xfrm>
-                      <a:off x="0" y="0"/>
-                      <a:ext cx="5760000" cy="3600000"/>
-                    </a:xfrm>
-                    <a:prstGeom prst="rect"/>
-                  </pic:spPr>
-                </pic:pic>
-              </a:graphicData>
-            </a:graphic>
-          </wp:inline>
-        </w:drawing>
-      </w:r>
-    </w:p>
-    <w:p>
-      <w:pPr>
-        <w:jc w:val="center"/>
-      </w:pPr>
-      <w:r>
-        <w:rPr>
-          <w:i/>
-          <w:color w:val="606060"/>
-          <w:sz w:val="18"/>
-        </w:rPr>
-        <w:t>01-jaeger-trace-service-a-service-b.png</w:t>
-      </w:r>
-    </w:p>
-    <w:p>
-      <w:pPr>
-        <w:pStyle w:val="Heading2"/>
-      </w:pPr>
-      <w:r>
-        <w:t>5.2 Correlación logs ↔ trazas en Grafana</w:t>
-      </w:r>
-    </w:p>
-    <w:p>
-      <w:r>
-        <w:t>El datasource Loki (</w:t>
-      </w:r>
-      <w:r>
-        <w:rPr>
-          <w:rFonts w:ascii="Consolas" w:hAnsi="Consolas"/>
-          <w:color w:val="B03060"/>
-          <w:sz w:val="20"/>
-        </w:rPr>
-        <w:t>observability/grafana/provisioning/datasources/datasources.yaml</w:t>
-      </w:r>
-      <w:r>
-        <w:t xml:space="preserve">) define un </w:t>
-      </w:r>
-      <w:r>
-        <w:rPr>
-          <w:rFonts w:ascii="Consolas" w:hAnsi="Consolas"/>
-          <w:color w:val="B03060"/>
-          <w:sz w:val="20"/>
-        </w:rPr>
-        <w:t>derivedFields</w:t>
-      </w:r>
-      <w:r>
-        <w:t xml:space="preserve"> que detecta el patrón </w:t>
-      </w:r>
-      <w:r>
-        <w:rPr>
-          <w:rFonts w:ascii="Consolas" w:hAnsi="Consolas"/>
-          <w:color w:val="B03060"/>
-          <w:sz w:val="20"/>
-        </w:rPr>
-        <w:t>"traceid":"([0-9a-f]{32})"</w:t>
-      </w:r>
-      <w:r>
-        <w:t xml:space="preserve"> en cada línea de log y ofrece un enlace directo a Jaeger con ese </w:t>
-      </w:r>
-      <w:r>
-        <w:rPr>
-          <w:rFonts w:ascii="Consolas" w:hAnsi="Consolas"/>
-          <w:color w:val="B03060"/>
-          <w:sz w:val="20"/>
-        </w:rPr>
-        <w:t>trace_id</w:t>
-      </w:r>
-      <w:r>
-        <w:t xml:space="preserve">. En la dirección inversa, el datasource Jaeger define </w:t>
-      </w:r>
-      <w:r>
-        <w:rPr>
-          <w:rFonts w:ascii="Consolas" w:hAnsi="Consolas"/>
-          <w:color w:val="B03060"/>
-          <w:sz w:val="20"/>
-        </w:rPr>
-        <w:t>tracesToLogsV2</w:t>
-      </w:r>
-      <w:r>
-        <w:t xml:space="preserve"> con una consulta LogQL explícita:</w:t>
-      </w:r>
-    </w:p>
-    <w:p>
-      <w:pPr>
-        <w:pStyle w:val="CodeBlock"/>
-        <w:shd w:val="clear" w:color="auto" w:fill="F2F2F2"/>
-      </w:pPr>
-      <w:r>
-        <w:t>{service_name="${__span.tags["service.name"]}"} | json | traceid="${__span.traceId}"</w:t>
-      </w:r>
-    </w:p>
-    <w:p>
-      <w:r>
-        <w:t xml:space="preserve">que arma la consulta desde el span seleccionado. Deliberadamente </w:t>
-      </w:r>
-      <w:r>
-        <w:rPr>
-          <w:rFonts w:ascii="Consolas" w:hAnsi="Consolas"/>
-          <w:color w:val="B03060"/>
-          <w:sz w:val="20"/>
-        </w:rPr>
-        <w:t>trace_id</w:t>
-      </w:r>
-      <w:r>
-        <w:t xml:space="preserve"> </w:t>
-      </w:r>
-      <w:r>
-        <w:rPr>
-          <w:b/>
-        </w:rPr>
-        <w:t>no</w:t>
-      </w:r>
-      <w:r>
-        <w:t xml:space="preserve"> es un label indexado de Loki (sería alta cardinalidad — un label nuevo por cada request); se filtra con </w:t>
-      </w:r>
-      <w:r>
-        <w:rPr>
-          <w:rFonts w:ascii="Consolas" w:hAnsi="Consolas"/>
-          <w:color w:val="B03060"/>
-          <w:sz w:val="20"/>
-        </w:rPr>
-        <w:t>| json</w:t>
-      </w:r>
-      <w:r>
-        <w:t xml:space="preserve"> sobre el cuerpo del log, que es la práctica recomendada por Grafana Labs para este patrón.</w:t>
-      </w:r>
-    </w:p>
-    <w:p>
-      <w:r>
-        <w:t xml:space="preserve">Panel de Grafana Explore: buscar </w:t>
-      </w:r>
-      <w:r>
-        <w:rPr>
-          <w:rFonts w:ascii="Consolas" w:hAnsi="Consolas"/>
-          <w:color w:val="B03060"/>
-          <w:sz w:val="20"/>
-        </w:rPr>
-        <w:t>{service_name="service-a"}</w:t>
-      </w:r>
-      <w:r>
-        <w:t xml:space="preserve"> en Loki, localizar la línea </w:t>
-      </w:r>
-      <w:r>
-        <w:rPr>
-          <w:rFonts w:ascii="Consolas" w:hAnsi="Consolas"/>
-          <w:color w:val="B03060"/>
-          <w:sz w:val="20"/>
-        </w:rPr>
-        <w:t>order_fetched</w:t>
-      </w:r>
-      <w:r>
-        <w:t xml:space="preserve"> con </w:t>
-      </w:r>
-      <w:r>
-        <w:rPr>
-          <w:rFonts w:ascii="Consolas" w:hAnsi="Consolas"/>
-          <w:color w:val="B03060"/>
-          <w:sz w:val="20"/>
-        </w:rPr>
-        <w:t>"traceid":"556bbf3c..."</w:t>
-      </w:r>
-      <w:r>
-        <w:t xml:space="preserve">, click en "Ver traza en Jaeger" → salta directo al flame graph de la sección 3.2. Este es el flujo que reduce el diagnóstico de horas (correlacionar logs y trazas a mano por timestamp) a minutos. Evidencia real en </w:t>
-      </w:r>
-      <w:r>
-        <w:rPr>
-          <w:rFonts w:ascii="Consolas" w:hAnsi="Consolas"/>
-          <w:i/>
-          <w:color w:val="2E5B9E"/>
-        </w:rPr>
-        <w:t>docs/screenshots/03-grafana-explore-logs-trazas-correlacion.png</w:t>
-      </w:r>
-      <w:r>
-        <w:t xml:space="preserve">: el log </w:t>
-      </w:r>
-      <w:r>
-        <w:rPr>
-          <w:rFonts w:ascii="Consolas" w:hAnsi="Consolas"/>
-          <w:color w:val="B03060"/>
-          <w:sz w:val="20"/>
-        </w:rPr>
-        <w:t>inventory_checked</w:t>
-      </w:r>
-      <w:r>
-        <w:t xml:space="preserve"> expandido muestra el campo </w:t>
-      </w:r>
-      <w:r>
-        <w:rPr>
-          <w:rFonts w:ascii="Consolas" w:hAnsi="Consolas"/>
-          <w:color w:val="B03060"/>
-          <w:sz w:val="20"/>
-        </w:rPr>
-        <w:t>traceid</w:t>
-      </w:r>
-      <w:r>
-        <w:t xml:space="preserve"> y, en la sección "Links", el botón "Ver traza en Jaeger" generado por el </w:t>
-      </w:r>
-      <w:r>
-        <w:rPr>
-          <w:rFonts w:ascii="Consolas" w:hAnsi="Consolas"/>
-          <w:color w:val="B03060"/>
-          <w:sz w:val="20"/>
-        </w:rPr>
-        <w:t>derivedFields</w:t>
-      </w:r>
-      <w:r>
-        <w:t xml:space="preserve"> del datasource.</w:t>
-      </w:r>
-    </w:p>
-    <w:p>
-      <w:r>
-        <w:drawing>
-          <wp:inline xmlns:a="http://schemas.openxmlformats.org/drawingml/2006/main" xmlns:pic="http://schemas.openxmlformats.org/drawingml/2006/picture">
-            <wp:extent cx="5760000" cy="3600000"/>
-            <wp:docPr id="2" name="Picture 2"/>
-            <wp:cNvGraphicFramePr>
-              <a:graphicFrameLocks noChangeAspect="1"/>
-            </wp:cNvGraphicFramePr>
-            <a:graphic>
-              <a:graphicData uri="http://schemas.openxmlformats.org/drawingml/2006/picture">
-                <pic:pic>
-                  <pic:nvPicPr>
-                    <pic:cNvPr id="0" name="03-grafana-explore-logs-trazas-correlacion.png"/>
                     <pic:cNvPicPr/>
                   </pic:nvPicPr>
                   <pic:blipFill>
@@ -2193,7 +2014,7 @@
           <w:color w:val="606060"/>
           <w:sz w:val="18"/>
         </w:rPr>
-        <w:t>03-grafana-explore-logs-trazas-correlacion.png</w:t>
+        <w:t>01-jaeger-trace-service-a-service-b.png</w:t>
       </w:r>
     </w:p>
     <w:p>
@@ -2201,20 +2022,150 @@
         <w:pStyle w:val="Heading2"/>
       </w:pPr>
       <w:r>
-        <w:t>5.3 Dashboard Grafana — 6 paneles</w:t>
+        <w:t>5.2 Correlación logs ↔ trazas en Grafana</w:t>
       </w:r>
     </w:p>
     <w:p>
+      <w:r>
+        <w:t>El datasource Loki (</w:t>
+      </w:r>
       <w:r>
         <w:rPr>
           <w:rFonts w:ascii="Consolas" w:hAnsi="Consolas"/>
           <w:color w:val="B03060"/>
           <w:sz w:val="20"/>
         </w:rPr>
-        <w:t>observability/grafana/dashboards/otel-lab-dashboard.json</w:t>
-      </w:r>
-      <w:r>
-        <w:t xml:space="preserve">, provisionado automáticamente en la carpeta "OTel Lab" — ver captura </w:t>
+        <w:t>observability/grafana/provisioning/datasources/datasources.yaml</w:t>
+      </w:r>
+      <w:r>
+        <w:t xml:space="preserve">) define un </w:t>
+      </w:r>
+      <w:r>
+        <w:rPr>
+          <w:rFonts w:ascii="Consolas" w:hAnsi="Consolas"/>
+          <w:color w:val="B03060"/>
+          <w:sz w:val="20"/>
+        </w:rPr>
+        <w:t>derivedFields</w:t>
+      </w:r>
+      <w:r>
+        <w:t xml:space="preserve"> que detecta el patrón </w:t>
+      </w:r>
+      <w:r>
+        <w:rPr>
+          <w:rFonts w:ascii="Consolas" w:hAnsi="Consolas"/>
+          <w:color w:val="B03060"/>
+          <w:sz w:val="20"/>
+        </w:rPr>
+        <w:t>"traceid":"([0-9a-f]{32})"</w:t>
+      </w:r>
+      <w:r>
+        <w:t xml:space="preserve"> en cada línea de log y ofrece un enlace directo a Jaeger con ese </w:t>
+      </w:r>
+      <w:r>
+        <w:rPr>
+          <w:rFonts w:ascii="Consolas" w:hAnsi="Consolas"/>
+          <w:color w:val="B03060"/>
+          <w:sz w:val="20"/>
+        </w:rPr>
+        <w:t>trace_id</w:t>
+      </w:r>
+      <w:r>
+        <w:t xml:space="preserve">. En la dirección inversa, el datasource Jaeger define </w:t>
+      </w:r>
+      <w:r>
+        <w:rPr>
+          <w:rFonts w:ascii="Consolas" w:hAnsi="Consolas"/>
+          <w:color w:val="B03060"/>
+          <w:sz w:val="20"/>
+        </w:rPr>
+        <w:t>tracesToLogsV2</w:t>
+      </w:r>
+      <w:r>
+        <w:t xml:space="preserve"> con una consulta LogQL explícita:</w:t>
+      </w:r>
+    </w:p>
+    <w:p>
+      <w:pPr>
+        <w:pStyle w:val="CodeBlock"/>
+        <w:shd w:val="clear" w:color="auto" w:fill="F2F2F2"/>
+      </w:pPr>
+      <w:r>
+        <w:t>{service_name="${__span.tags["service.name"]}"} | json | traceid="${__span.traceId}"</w:t>
+      </w:r>
+    </w:p>
+    <w:p>
+      <w:r>
+        <w:t xml:space="preserve">que arma la consulta desde el span seleccionado. Deliberadamente </w:t>
+      </w:r>
+      <w:r>
+        <w:rPr>
+          <w:rFonts w:ascii="Consolas" w:hAnsi="Consolas"/>
+          <w:color w:val="B03060"/>
+          <w:sz w:val="20"/>
+        </w:rPr>
+        <w:t>trace_id</w:t>
+      </w:r>
+      <w:r>
+        <w:t xml:space="preserve"> </w:t>
+      </w:r>
+      <w:r>
+        <w:rPr>
+          <w:b/>
+        </w:rPr>
+        <w:t>no</w:t>
+      </w:r>
+      <w:r>
+        <w:t xml:space="preserve"> es un label indexado de Loki (sería alta cardinalidad — un label nuevo por cada request); se filtra con </w:t>
+      </w:r>
+      <w:r>
+        <w:rPr>
+          <w:rFonts w:ascii="Consolas" w:hAnsi="Consolas"/>
+          <w:color w:val="B03060"/>
+          <w:sz w:val="20"/>
+        </w:rPr>
+        <w:t>| json</w:t>
+      </w:r>
+      <w:r>
+        <w:t xml:space="preserve"> sobre el cuerpo del log, que es la práctica recomendada por Grafana Labs para este patrón.</w:t>
+      </w:r>
+    </w:p>
+    <w:p>
+      <w:r>
+        <w:t xml:space="preserve">Panel de Grafana Explore: buscar </w:t>
+      </w:r>
+      <w:r>
+        <w:rPr>
+          <w:rFonts w:ascii="Consolas" w:hAnsi="Consolas"/>
+          <w:color w:val="B03060"/>
+          <w:sz w:val="20"/>
+        </w:rPr>
+        <w:t>{service_name="service-a"}</w:t>
+      </w:r>
+      <w:r>
+        <w:t xml:space="preserve"> en Loki, localizar la línea </w:t>
+      </w:r>
+      <w:r>
+        <w:rPr>
+          <w:rFonts w:ascii="Consolas" w:hAnsi="Consolas"/>
+          <w:color w:val="B03060"/>
+          <w:sz w:val="20"/>
+        </w:rPr>
+        <w:t>order_fetched</w:t>
+      </w:r>
+      <w:r>
+        <w:t xml:space="preserve"> con </w:t>
+      </w:r>
+      <w:r>
+        <w:rPr>
+          <w:rFonts w:ascii="Consolas" w:hAnsi="Consolas"/>
+          <w:color w:val="B03060"/>
+          <w:sz w:val="20"/>
+        </w:rPr>
+        <w:t>"traceid":"556bbf3c..."</w:t>
+      </w:r>
+      <w:r>
+        <w:t xml:space="preserve">, click en "Ver traza en Jaeger" → salta directo al flame graph de la sección 3.2. Este es el flujo que reduce el diagnóstico de horas (correlacionar logs y trazas a mano por timestamp) a minutos. Evidencia real en </w:t>
       </w:r>
       <w:r>
         <w:rPr>
@@ -2222,10 +2173,43 @@
           <w:i/>
           <w:color w:val="2E5B9E"/>
         </w:rPr>
-        <w:t>docs/screenshots/02-grafana-dashboard-6-paneles.png</w:t>
-      </w:r>
-      <w:r>
-        <w:t xml:space="preserve"> con tráfico real: 100% disponibilidad, 0% error rate, p95 ~48ms:</w:t>
+        <w:t>docs/screenshots/03-grafana-explore-logs-trazas-correlacion.png</w:t>
+      </w:r>
+      <w:r>
+        <w:t xml:space="preserve">: el log </w:t>
+      </w:r>
+      <w:r>
+        <w:rPr>
+          <w:rFonts w:ascii="Consolas" w:hAnsi="Consolas"/>
+          <w:color w:val="B03060"/>
+          <w:sz w:val="20"/>
+        </w:rPr>
+        <w:t>inventory_checked</w:t>
+      </w:r>
+      <w:r>
+        <w:t xml:space="preserve"> expandido muestra el campo </w:t>
+      </w:r>
+      <w:r>
+        <w:rPr>
+          <w:rFonts w:ascii="Consolas" w:hAnsi="Consolas"/>
+          <w:color w:val="B03060"/>
+          <w:sz w:val="20"/>
+        </w:rPr>
+        <w:t>traceid</w:t>
+      </w:r>
+      <w:r>
+        <w:t xml:space="preserve"> y, en la sección "Links", el botón "Ver traza en Jaeger" generado por el </w:t>
+      </w:r>
+      <w:r>
+        <w:rPr>
+          <w:rFonts w:ascii="Consolas" w:hAnsi="Consolas"/>
+          <w:color w:val="B03060"/>
+          <w:sz w:val="20"/>
+        </w:rPr>
+        <w:t>derivedFields</w:t>
+      </w:r>
+      <w:r>
+        <w:t xml:space="preserve"> del datasource.</w:t>
       </w:r>
     </w:p>
     <w:p>
@@ -2241,11 +2225,92 @@
               <a:graphicData uri="http://schemas.openxmlformats.org/drawingml/2006/picture">
                 <pic:pic>
                   <pic:nvPicPr>
+                    <pic:cNvPr id="0" name="03-grafana-explore-logs-trazas-correlacion.png"/>
+                    <pic:cNvPicPr/>
+                  </pic:nvPicPr>
+                  <pic:blipFill>
+                    <a:blip r:embed="rId11"/>
+                    <a:stretch>
+                      <a:fillRect/>
+                    </a:stretch>
+                  </pic:blipFill>
+                  <pic:spPr>
+                    <a:xfrm>
+                      <a:off x="0" y="0"/>
+                      <a:ext cx="5760000" cy="3600000"/>
+                    </a:xfrm>
+                    <a:prstGeom prst="rect"/>
+                  </pic:spPr>
+                </pic:pic>
+              </a:graphicData>
+            </a:graphic>
+          </wp:inline>
+        </w:drawing>
+      </w:r>
+    </w:p>
+    <w:p>
+      <w:pPr>
+        <w:jc w:val="center"/>
+      </w:pPr>
+      <w:r>
+        <w:rPr>
+          <w:i/>
+          <w:color w:val="606060"/>
+          <w:sz w:val="18"/>
+        </w:rPr>
+        <w:t>03-grafana-explore-logs-trazas-correlacion.png</w:t>
+      </w:r>
+    </w:p>
+    <w:p>
+      <w:pPr>
+        <w:pStyle w:val="Heading2"/>
+      </w:pPr>
+      <w:r>
+        <w:t>5.3 Dashboard Grafana — 6 paneles</w:t>
+      </w:r>
+    </w:p>
+    <w:p>
+      <w:r>
+        <w:rPr>
+          <w:rFonts w:ascii="Consolas" w:hAnsi="Consolas"/>
+          <w:color w:val="B03060"/>
+          <w:sz w:val="20"/>
+        </w:rPr>
+        <w:t>observability/grafana/dashboards/otel-lab-dashboard.json</w:t>
+      </w:r>
+      <w:r>
+        <w:t xml:space="preserve">, provisionado automáticamente en la carpeta "OTel Lab" — ver captura </w:t>
+      </w:r>
+      <w:r>
+        <w:rPr>
+          <w:rFonts w:ascii="Consolas" w:hAnsi="Consolas"/>
+          <w:i/>
+          <w:color w:val="2E5B9E"/>
+        </w:rPr>
+        <w:t>docs/screenshots/02-grafana-dashboard-6-paneles.png</w:t>
+      </w:r>
+      <w:r>
+        <w:t xml:space="preserve"> con tráfico real: 100% disponibilidad, 0% error rate, p95 ~48ms:</w:t>
+      </w:r>
+    </w:p>
+    <w:p>
+      <w:r>
+        <w:drawing>
+          <wp:inline xmlns:a="http://schemas.openxmlformats.org/drawingml/2006/main" xmlns:pic="http://schemas.openxmlformats.org/drawingml/2006/picture">
+            <wp:extent cx="5760000" cy="3600000"/>
+            <wp:docPr id="4" name="Picture 4"/>
+            <wp:cNvGraphicFramePr>
+              <a:graphicFrameLocks noChangeAspect="1"/>
+            </wp:cNvGraphicFramePr>
+            <a:graphic>
+              <a:graphicData uri="http://schemas.openxmlformats.org/drawingml/2006/picture">
+                <pic:pic>
+                  <pic:nvPicPr>
                     <pic:cNvPr id="0" name="02-grafana-dashboard-6-paneles.png"/>
                     <pic:cNvPicPr/>
                   </pic:nvPicPr>
                   <pic:blipFill>
-                    <a:blip r:embed="rId11"/>
+                    <a:blip r:embed="rId12"/>
                     <a:stretch>
                       <a:fillRect/>
                     </a:stretch>
@@ -3288,7 +3353,132 @@
         <w:t>+518.42 ms (+37.0%)</w:t>
       </w:r>
       <w:r>
-        <w:t>. Total de requests: 13 902 (baseline) y 12 463 (con OTel) en sus respectivas ventanas de 5 minutos.</w:t>
+        <w:t xml:space="preserve">. Total de requests: 13 902 (baseline) y 12 463 (con OTel) en sus respectivas ventanas de 5 minutos — ver gráfico </w:t>
+      </w:r>
+      <w:r>
+        <w:rPr>
+          <w:rFonts w:ascii="Consolas" w:hAnsi="Consolas"/>
+          <w:i/>
+          <w:color w:val="2E5B9E"/>
+        </w:rPr>
+        <w:t>docs/charts/01_latencia_baseline_vs_otel.png</w:t>
+      </w:r>
+      <w:r>
+        <w:t>.</w:t>
+      </w:r>
+    </w:p>
+    <w:p>
+      <w:r>
+        <w:drawing>
+          <wp:inline xmlns:a="http://schemas.openxmlformats.org/drawingml/2006/main" xmlns:pic="http://schemas.openxmlformats.org/drawingml/2006/picture">
+            <wp:extent cx="5760000" cy="3631304"/>
+            <wp:docPr id="5" name="Picture 5"/>
+            <wp:cNvGraphicFramePr>
+              <a:graphicFrameLocks noChangeAspect="1"/>
+            </wp:cNvGraphicFramePr>
+            <a:graphic>
+              <a:graphicData uri="http://schemas.openxmlformats.org/drawingml/2006/picture">
+                <pic:pic>
+                  <pic:nvPicPr>
+                    <pic:cNvPr id="0" name="01_latencia_baseline_vs_otel.png"/>
+                    <pic:cNvPicPr/>
+                  </pic:nvPicPr>
+                  <pic:blipFill>
+                    <a:blip r:embed="rId13"/>
+                    <a:stretch>
+                      <a:fillRect/>
+                    </a:stretch>
+                  </pic:blipFill>
+                  <pic:spPr>
+                    <a:xfrm>
+                      <a:off x="0" y="0"/>
+                      <a:ext cx="5760000" cy="3631304"/>
+                    </a:xfrm>
+                    <a:prstGeom prst="rect"/>
+                  </pic:spPr>
+                </pic:pic>
+              </a:graphicData>
+            </a:graphic>
+          </wp:inline>
+        </w:drawing>
+      </w:r>
+    </w:p>
+    <w:p>
+      <w:pPr>
+        <w:jc w:val="center"/>
+      </w:pPr>
+      <w:r>
+        <w:rPr>
+          <w:i/>
+          <w:color w:val="606060"/>
+          <w:sz w:val="18"/>
+        </w:rPr>
+        <w:t>01_latencia_baseline_vs_otel.png</w:t>
+      </w:r>
+    </w:p>
+    <w:p>
+      <w:r>
+        <w:t xml:space="preserve">Throughput: -10.5% con OTel, consistente con la cola de requests generada por el bloqueo del event loop (ver 6.3) — ver gráfico </w:t>
+      </w:r>
+      <w:r>
+        <w:rPr>
+          <w:rFonts w:ascii="Consolas" w:hAnsi="Consolas"/>
+          <w:i/>
+          <w:color w:val="2E5B9E"/>
+        </w:rPr>
+        <w:t>docs/charts/02_throughput_baseline_vs_otel.png</w:t>
+      </w:r>
+      <w:r>
+        <w:t>.</w:t>
+      </w:r>
+    </w:p>
+    <w:p>
+      <w:r>
+        <w:drawing>
+          <wp:inline xmlns:a="http://schemas.openxmlformats.org/drawingml/2006/main" xmlns:pic="http://schemas.openxmlformats.org/drawingml/2006/picture">
+            <wp:extent cx="5760000" cy="4772571"/>
+            <wp:docPr id="6" name="Picture 6"/>
+            <wp:cNvGraphicFramePr>
+              <a:graphicFrameLocks noChangeAspect="1"/>
+            </wp:cNvGraphicFramePr>
+            <a:graphic>
+              <a:graphicData uri="http://schemas.openxmlformats.org/drawingml/2006/picture">
+                <pic:pic>
+                  <pic:nvPicPr>
+                    <pic:cNvPr id="0" name="02_throughput_baseline_vs_otel.png"/>
+                    <pic:cNvPicPr/>
+                  </pic:nvPicPr>
+                  <pic:blipFill>
+                    <a:blip r:embed="rId14"/>
+                    <a:stretch>
+                      <a:fillRect/>
+                    </a:stretch>
+                  </pic:blipFill>
+                  <pic:spPr>
+                    <a:xfrm>
+                      <a:off x="0" y="0"/>
+                      <a:ext cx="5760000" cy="4772571"/>
+                    </a:xfrm>
+                    <a:prstGeom prst="rect"/>
+                  </pic:spPr>
+                </pic:pic>
+              </a:graphicData>
+            </a:graphic>
+          </wp:inline>
+        </w:drawing>
+      </w:r>
+    </w:p>
+    <w:p>
+      <w:pPr>
+        <w:jc w:val="center"/>
+      </w:pPr>
+      <w:r>
+        <w:rPr>
+          <w:i/>
+          <w:color w:val="606060"/>
+          <w:sz w:val="18"/>
+        </w:rPr>
+        <w:t>02_throughput_baseline_vs_otel.png</w:t>
       </w:r>
     </w:p>
     <w:p>
@@ -3550,7 +3740,457 @@
     <w:p/>
     <w:p>
       <w:r>
-        <w:t xml:space="preserve">Los porcentajes de CPU muestreados con </w:t>
+        <w:t xml:space="preserve">Ver gráfico </w:t>
+      </w:r>
+      <w:r>
+        <w:rPr>
+          <w:rFonts w:ascii="Consolas" w:hAnsi="Consolas"/>
+          <w:i/>
+          <w:color w:val="2E5B9E"/>
+        </w:rPr>
+        <w:t>docs/charts/03_memoria_rss_baseline_vs_otel.png</w:t>
+      </w:r>
+      <w:r>
+        <w:t>.</w:t>
+      </w:r>
+    </w:p>
+    <w:p>
+      <w:r>
+        <w:drawing>
+          <wp:inline xmlns:a="http://schemas.openxmlformats.org/drawingml/2006/main" xmlns:pic="http://schemas.openxmlformats.org/drawingml/2006/picture">
+            <wp:extent cx="5760000" cy="3631304"/>
+            <wp:docPr id="7" name="Picture 7"/>
+            <wp:cNvGraphicFramePr>
+              <a:graphicFrameLocks noChangeAspect="1"/>
+            </wp:cNvGraphicFramePr>
+            <a:graphic>
+              <a:graphicData uri="http://schemas.openxmlformats.org/drawingml/2006/picture">
+                <pic:pic>
+                  <pic:nvPicPr>
+                    <pic:cNvPr id="0" name="03_memoria_rss_baseline_vs_otel.png"/>
+                    <pic:cNvPicPr/>
+                  </pic:nvPicPr>
+                  <pic:blipFill>
+                    <a:blip r:embed="rId15"/>
+                    <a:stretch>
+                      <a:fillRect/>
+                    </a:stretch>
+                  </pic:blipFill>
+                  <pic:spPr>
+                    <a:xfrm>
+                      <a:off x="0" y="0"/>
+                      <a:ext cx="5760000" cy="3631304"/>
+                    </a:xfrm>
+                    <a:prstGeom prst="rect"/>
+                  </pic:spPr>
+                </pic:pic>
+              </a:graphicData>
+            </a:graphic>
+          </wp:inline>
+        </w:drawing>
+      </w:r>
+    </w:p>
+    <w:p>
+      <w:pPr>
+        <w:jc w:val="center"/>
+      </w:pPr>
+      <w:r>
+        <w:rPr>
+          <w:i/>
+          <w:color w:val="606060"/>
+          <w:sz w:val="18"/>
+        </w:rPr>
+        <w:t>03_memoria_rss_baseline_vs_otel.png</w:t>
+      </w:r>
+    </w:p>
+    <w:p>
+      <w:r>
+        <w:t xml:space="preserve">CPU promedio por contenedor, muestreado con </w:t>
+      </w:r>
+      <w:r>
+        <w:rPr>
+          <w:rFonts w:ascii="Consolas" w:hAnsi="Consolas"/>
+          <w:color w:val="B03060"/>
+          <w:sz w:val="20"/>
+        </w:rPr>
+        <w:t>docker stats --no-stream</w:t>
+      </w:r>
+      <w:r>
+        <w:t xml:space="preserve"> cada ~1-2s durante toda la ventana de carga (60 VUs, 5 min) y promediado sobre todas las muestras — no un snapshot puntual como en un intento anterior, que había resultado con demasiado ruido (variaba 15-38% entre muestras de 2s sin dirección consistente) para reportarse como cifra confiable:</w:t>
+      </w:r>
+    </w:p>
+    <w:tbl>
+      <w:tblPr>
+        <w:tblStyle w:val="LightGrid-Accent1"/>
+        <w:tblW w:type="auto" w:w="0"/>
+        <w:tblLook w:firstColumn="1" w:firstRow="1" w:lastColumn="0" w:lastRow="0" w:noHBand="0" w:noVBand="1" w:val="04A0"/>
+      </w:tblPr>
+      <w:tblGrid>
+        <w:gridCol w:w="2351"/>
+        <w:gridCol w:w="2351"/>
+        <w:gridCol w:w="2351"/>
+        <w:gridCol w:w="2351"/>
+      </w:tblGrid>
+      <w:tr>
+        <w:tc>
+          <w:tcPr>
+            <w:tcW w:type="dxa" w:w="2351"/>
+          </w:tcPr>
+          <w:p>
+            <w:r>
+              <w:rPr>
+                <w:b/>
+              </w:rPr>
+            </w:r>
+            <w:r>
+              <w:rPr>
+                <w:b/>
+              </w:rPr>
+              <w:t>Contenedor</w:t>
+            </w:r>
+          </w:p>
+        </w:tc>
+        <w:tc>
+          <w:tcPr>
+            <w:tcW w:type="dxa" w:w="2351"/>
+          </w:tcPr>
+          <w:p>
+            <w:r>
+              <w:rPr>
+                <w:b/>
+              </w:rPr>
+            </w:r>
+            <w:r>
+              <w:rPr>
+                <w:b/>
+              </w:rPr>
+              <w:t>Sin OTel (baseline)</w:t>
+            </w:r>
+          </w:p>
+        </w:tc>
+        <w:tc>
+          <w:tcPr>
+            <w:tcW w:type="dxa" w:w="2351"/>
+          </w:tcPr>
+          <w:p>
+            <w:r>
+              <w:rPr>
+                <w:b/>
+              </w:rPr>
+            </w:r>
+            <w:r>
+              <w:rPr>
+                <w:b/>
+              </w:rPr>
+              <w:t>Con OTel SDK</w:t>
+            </w:r>
+          </w:p>
+        </w:tc>
+        <w:tc>
+          <w:tcPr>
+            <w:tcW w:type="dxa" w:w="2351"/>
+          </w:tcPr>
+          <w:p>
+            <w:r>
+              <w:rPr>
+                <w:b/>
+              </w:rPr>
+            </w:r>
+            <w:r>
+              <w:rPr>
+                <w:b/>
+              </w:rPr>
+              <w:t>Overhead</w:t>
+            </w:r>
+          </w:p>
+        </w:tc>
+      </w:tr>
+      <w:tr>
+        <w:tc>
+          <w:tcPr>
+            <w:tcW w:type="dxa" w:w="2351"/>
+          </w:tcPr>
+          <w:p>
+            <w:r/>
+            <w:r>
+              <w:rPr>
+                <w:rFonts w:ascii="Consolas" w:hAnsi="Consolas"/>
+                <w:color w:val="B03060"/>
+                <w:sz w:val="20"/>
+              </w:rPr>
+              <w:t>service-a</w:t>
+            </w:r>
+          </w:p>
+        </w:tc>
+        <w:tc>
+          <w:tcPr>
+            <w:tcW w:type="dxa" w:w="2351"/>
+          </w:tcPr>
+          <w:p>
+            <w:r/>
+            <w:r>
+              <w:t>56.92%</w:t>
+            </w:r>
+          </w:p>
+        </w:tc>
+        <w:tc>
+          <w:tcPr>
+            <w:tcW w:type="dxa" w:w="2351"/>
+          </w:tcPr>
+          <w:p>
+            <w:r/>
+            <w:r>
+              <w:t>60.45%</w:t>
+            </w:r>
+          </w:p>
+        </w:tc>
+        <w:tc>
+          <w:tcPr>
+            <w:tcW w:type="dxa" w:w="2351"/>
+          </w:tcPr>
+          <w:p>
+            <w:r/>
+            <w:r>
+              <w:t>+3.53 pp (+6.2%)</w:t>
+            </w:r>
+          </w:p>
+        </w:tc>
+      </w:tr>
+      <w:tr>
+        <w:tc>
+          <w:tcPr>
+            <w:tcW w:type="dxa" w:w="2351"/>
+          </w:tcPr>
+          <w:p>
+            <w:r/>
+            <w:r>
+              <w:rPr>
+                <w:rFonts w:ascii="Consolas" w:hAnsi="Consolas"/>
+                <w:color w:val="B03060"/>
+                <w:sz w:val="20"/>
+              </w:rPr>
+              <w:t>service-b</w:t>
+            </w:r>
+          </w:p>
+        </w:tc>
+        <w:tc>
+          <w:tcPr>
+            <w:tcW w:type="dxa" w:w="2351"/>
+          </w:tcPr>
+          <w:p>
+            <w:r/>
+            <w:r>
+              <w:t>3.48%</w:t>
+            </w:r>
+          </w:p>
+        </w:tc>
+        <w:tc>
+          <w:tcPr>
+            <w:tcW w:type="dxa" w:w="2351"/>
+          </w:tcPr>
+          <w:p>
+            <w:r/>
+            <w:r>
+              <w:t>6.59%</w:t>
+            </w:r>
+          </w:p>
+        </w:tc>
+        <w:tc>
+          <w:tcPr>
+            <w:tcW w:type="dxa" w:w="2351"/>
+          </w:tcPr>
+          <w:p>
+            <w:r/>
+            <w:r>
+              <w:t>+3.11 pp (+89.5%)</w:t>
+            </w:r>
+          </w:p>
+        </w:tc>
+      </w:tr>
+      <w:tr>
+        <w:tc>
+          <w:tcPr>
+            <w:tcW w:type="dxa" w:w="2351"/>
+          </w:tcPr>
+          <w:p>
+            <w:r/>
+            <w:r>
+              <w:rPr>
+                <w:rFonts w:ascii="Consolas" w:hAnsi="Consolas"/>
+                <w:color w:val="B03060"/>
+                <w:sz w:val="20"/>
+              </w:rPr>
+              <w:t>otel-collector</w:t>
+            </w:r>
+          </w:p>
+        </w:tc>
+        <w:tc>
+          <w:tcPr>
+            <w:tcW w:type="dxa" w:w="2351"/>
+          </w:tcPr>
+          <w:p>
+            <w:r/>
+            <w:r>
+              <w:t>0.23%</w:t>
+            </w:r>
+          </w:p>
+        </w:tc>
+        <w:tc>
+          <w:tcPr>
+            <w:tcW w:type="dxa" w:w="2351"/>
+          </w:tcPr>
+          <w:p>
+            <w:r/>
+            <w:r>
+              <w:t>1.54%</w:t>
+            </w:r>
+          </w:p>
+        </w:tc>
+        <w:tc>
+          <w:tcPr>
+            <w:tcW w:type="dxa" w:w="2351"/>
+          </w:tcPr>
+          <w:p>
+            <w:r/>
+            <w:r>
+              <w:t>+1.32 pp (+584.6%)</w:t>
+            </w:r>
+          </w:p>
+        </w:tc>
+      </w:tr>
+    </w:tbl>
+    <w:p/>
+    <w:p>
+      <w:r>
+        <w:t xml:space="preserve">Ver gráfico </w:t>
+      </w:r>
+      <w:r>
+        <w:rPr>
+          <w:rFonts w:ascii="Consolas" w:hAnsi="Consolas"/>
+          <w:i/>
+          <w:color w:val="2E5B9E"/>
+        </w:rPr>
+        <w:t>docs/charts/05_cpu_baseline_vs_otel.png</w:t>
+      </w:r>
+      <w:r>
+        <w:t>.</w:t>
+      </w:r>
+    </w:p>
+    <w:p>
+      <w:r>
+        <w:drawing>
+          <wp:inline xmlns:a="http://schemas.openxmlformats.org/drawingml/2006/main" xmlns:pic="http://schemas.openxmlformats.org/drawingml/2006/picture">
+            <wp:extent cx="5760000" cy="3586415"/>
+            <wp:docPr id="8" name="Picture 8"/>
+            <wp:cNvGraphicFramePr>
+              <a:graphicFrameLocks noChangeAspect="1"/>
+            </wp:cNvGraphicFramePr>
+            <a:graphic>
+              <a:graphicData uri="http://schemas.openxmlformats.org/drawingml/2006/picture">
+                <pic:pic>
+                  <pic:nvPicPr>
+                    <pic:cNvPr id="0" name="05_cpu_baseline_vs_otel.png"/>
+                    <pic:cNvPicPr/>
+                  </pic:nvPicPr>
+                  <pic:blipFill>
+                    <a:blip r:embed="rId16"/>
+                    <a:stretch>
+                      <a:fillRect/>
+                    </a:stretch>
+                  </pic:blipFill>
+                  <pic:spPr>
+                    <a:xfrm>
+                      <a:off x="0" y="0"/>
+                      <a:ext cx="5760000" cy="3586415"/>
+                    </a:xfrm>
+                    <a:prstGeom prst="rect"/>
+                  </pic:spPr>
+                </pic:pic>
+              </a:graphicData>
+            </a:graphic>
+          </wp:inline>
+        </w:drawing>
+      </w:r>
+    </w:p>
+    <w:p>
+      <w:pPr>
+        <w:jc w:val="center"/>
+      </w:pPr>
+      <w:r>
+        <w:rPr>
+          <w:i/>
+          <w:color w:val="606060"/>
+          <w:sz w:val="18"/>
+        </w:rPr>
+        <w:t>05_cpu_baseline_vs_otel.png</w:t>
+      </w:r>
+    </w:p>
+    <w:p>
+      <w:r>
+        <w:rPr>
+          <w:rFonts w:ascii="Consolas" w:hAnsi="Consolas"/>
+          <w:color w:val="B03060"/>
+          <w:sz w:val="20"/>
+        </w:rPr>
+        <w:t>service-a</w:t>
+      </w:r>
+      <w:r>
+        <w:t xml:space="preserve"> domina el consumo porque es el orquestador que atiende las 60 VUs directamente y hace la llamada saliente a </w:t>
+      </w:r>
+      <w:r>
+        <w:rPr>
+          <w:rFonts w:ascii="Consolas" w:hAnsi="Consolas"/>
+          <w:color w:val="B03060"/>
+          <w:sz w:val="20"/>
+        </w:rPr>
+        <w:t>service-b</w:t>
+      </w:r>
+      <w:r>
+        <w:t xml:space="preserve"> (ver 6.3 sobre el event loop bloqueado). El overhead relativo de </w:t>
+      </w:r>
+      <w:r>
+        <w:rPr>
+          <w:rFonts w:ascii="Consolas" w:hAnsi="Consolas"/>
+          <w:color w:val="B03060"/>
+          <w:sz w:val="20"/>
+        </w:rPr>
+        <w:t>service-b</w:t>
+      </w:r>
+      <w:r>
+        <w:t xml:space="preserve"> y </w:t>
+      </w:r>
+      <w:r>
+        <w:rPr>
+          <w:rFonts w:ascii="Consolas" w:hAnsi="Consolas"/>
+          <w:color w:val="B03060"/>
+          <w:sz w:val="20"/>
+        </w:rPr>
+        <w:t>otel-collector</w:t>
+      </w:r>
+      <w:r>
+        <w:t xml:space="preserve"> se ve inflado en términos porcentuales por tener una base muy baja (3-4% de un solo core) — en puntos porcentuales absolutos el overhead de los tres procesos es comparable (+1.3 a +3.5 pp).</w:t>
+      </w:r>
+    </w:p>
+    <w:p>
+      <w:r>
+        <w:rPr>
+          <w:b/>
+        </w:rPr>
+        <w:t>Nota de método:</w:t>
+      </w:r>
+      <w:r>
+        <w:t xml:space="preserve"> esta corrida de CPU se ejecutó por separado de la corrida "oficial" de latencia de la tabla anterior (mismo </w:t>
+      </w:r>
+      <w:r>
+        <w:rPr>
+          <w:rFonts w:ascii="Consolas" w:hAnsi="Consolas"/>
+          <w:color w:val="B03060"/>
+          <w:sz w:val="20"/>
+        </w:rPr>
+        <w:t>docker-compose</w:t>
+      </w:r>
+      <w:r>
+        <w:t>, mismo script k6, mismos 60 VUs/5 min, pero en una ejecución distinta) porque el propio proceso de muestreo (</w:t>
       </w:r>
       <w:r>
         <w:rPr>
@@ -3561,16 +4201,1232 @@
         <w:t>docker stats</w:t>
       </w:r>
       <w:r>
-        <w:t xml:space="preserve"> resultaron </w:t>
+        <w:t xml:space="preserve"> invocado cada 1-2s desde el host) compite por CPU en la VM compartida de Docker Desktop y distorsiona la latencia si se mide en la misma corrida que genera la carga — se confirmó empíricamente: la latencia p99 subía ~2x apenas se activaba el sampler, igual en baseline que en OTel. Por eso los números de latencia/throughput de 6.2 vienen de la corrida limpia (sin sampler) y los de CPU de una corrida aparte con metodología idéntica en ambos modos, así que el overhead </w:t>
+      </w:r>
+      <w:r>
+        <w:rPr>
+          <w:i/>
+        </w:rPr>
+        <w:t>relativo</w:t>
+      </w:r>
+      <w:r>
+        <w:t xml:space="preserve"> de CPU entre baseline y OTel sigue siendo válido aunque no se mezcle con los valores absolutos de latencia.</w:t>
+      </w:r>
+    </w:p>
+    <w:p>
+      <w:pPr>
+        <w:pStyle w:val="Heading2"/>
+      </w:pPr>
+      <w:r>
+        <w:t>6.3 Interpretación: por qué el overhead es más alto que la referencia de la industria</w:t>
+      </w:r>
+    </w:p>
+    <w:p>
+      <w:r>
+        <w:t xml:space="preserve">El material de la actividad cita un overhead de referencia de p99 &lt; 10ms como aceptable. Lo medido aquí (+518ms en p99) es un orden de magnitud mayor. La causa identificada </w:t>
       </w:r>
       <w:r>
         <w:rPr>
           <w:b/>
         </w:rPr>
-        <w:t>con demasiado ruido para reportarse como cifra confiable</w:t>
-      </w:r>
-      <w:r>
-        <w:t xml:space="preserve"> (variaban 15-38% entre muestras de 2 segundos, sin una dirección consistente): Docker Desktop en Windows corre los contenedores dentro de una VM compartida con scheduling de CPU que no es determinístico bajo ráfagas cortas. Para una medición de CPU rigurosa se necesitaría un perfilado continuo sobre toda la ventana de 5 minutos (p. ej. </w:t>
+        <w:t>no es el SDK de OTel en sí</w:t>
+      </w:r>
+      <w:r>
+        <w:t xml:space="preserve">, sino una decisión de arquitectura de la aplicación: </w:t>
+      </w:r>
+      <w:r>
+        <w:rPr>
+          <w:rFonts w:ascii="Consolas" w:hAnsi="Consolas"/>
+          <w:color w:val="B03060"/>
+          <w:sz w:val="20"/>
+        </w:rPr>
+        <w:t>services/*/app/main.py</w:t>
+      </w:r>
+      <w:r>
+        <w:t xml:space="preserve"> y </w:t>
+      </w:r>
+      <w:r>
+        <w:rPr>
+          <w:rFonts w:ascii="Consolas" w:hAnsi="Consolas"/>
+          <w:color w:val="B03060"/>
+          <w:sz w:val="20"/>
+        </w:rPr>
+        <w:t>db.py</w:t>
+      </w:r>
+      <w:r>
+        <w:t xml:space="preserve"> usan </w:t>
+      </w:r>
+      <w:r>
+        <w:rPr>
+          <w:rFonts w:ascii="Consolas" w:hAnsi="Consolas"/>
+          <w:color w:val="B03060"/>
+          <w:sz w:val="20"/>
+        </w:rPr>
+        <w:t>psycopg2</w:t>
+      </w:r>
+      <w:r>
+        <w:t xml:space="preserve"> (síncrono) y </w:t>
+      </w:r>
+      <w:r>
+        <w:rPr>
+          <w:rFonts w:ascii="Consolas" w:hAnsi="Consolas"/>
+          <w:color w:val="B03060"/>
+          <w:sz w:val="20"/>
+        </w:rPr>
+        <w:t>time.sleep()</w:t>
+      </w:r>
+      <w:r>
+        <w:t xml:space="preserve"> dentro de funciones </w:t>
+      </w:r>
+      <w:r>
+        <w:rPr>
+          <w:rFonts w:ascii="Consolas" w:hAnsi="Consolas"/>
+          <w:color w:val="B03060"/>
+          <w:sz w:val="20"/>
+        </w:rPr>
+        <w:t>async def</w:t>
+      </w:r>
+      <w:r>
+        <w:t xml:space="preserve">, sin desviarlos a un </w:t>
+      </w:r>
+      <w:r>
+        <w:rPr>
+          <w:i/>
+        </w:rPr>
+        <w:t>thread pool</w:t>
+      </w:r>
+      <w:r>
+        <w:t xml:space="preserve"> (</w:t>
+      </w:r>
+      <w:r>
+        <w:rPr>
+          <w:rFonts w:ascii="Consolas" w:hAnsi="Consolas"/>
+          <w:color w:val="B03060"/>
+          <w:sz w:val="20"/>
+        </w:rPr>
+        <w:t>run_in_executor</w:t>
+      </w:r>
+      <w:r>
+        <w:t>) ni usar un driver async (</w:t>
+      </w:r>
+      <w:r>
+        <w:rPr>
+          <w:rFonts w:ascii="Consolas" w:hAnsi="Consolas"/>
+          <w:color w:val="B03060"/>
+          <w:sz w:val="20"/>
+        </w:rPr>
+        <w:t>asyncpg</w:t>
+      </w:r>
+      <w:r>
+        <w:t xml:space="preserve">). Cada consulta bloquea el </w:t>
+      </w:r>
+      <w:r>
+        <w:rPr>
+          <w:i/>
+        </w:rPr>
+        <w:t>único</w:t>
+      </w:r>
+      <w:r>
+        <w:t xml:space="preserve"> hilo del event loop de </w:t>
+      </w:r>
+      <w:r>
+        <w:rPr>
+          <w:rFonts w:ascii="Consolas" w:hAnsi="Consolas"/>
+          <w:color w:val="B03060"/>
+          <w:sz w:val="20"/>
+        </w:rPr>
+        <w:t>uvicorn</w:t>
+      </w:r>
+      <w:r>
+        <w:t xml:space="preserve"> durante 8-150ms.</w:t>
+      </w:r>
+    </w:p>
+    <w:p>
+      <w:r>
+        <w:t xml:space="preserve">Bajo 60 VUs concurrentes, ese bloqueo ya genera una cola de requests esperando el hilo (de ahí la latencia base alta, ~1060ms, incluso sin OTel). Cuando se añade el trabajo síncrono adicional de OTel en el mismo hilo (construir spans, serializar atributos, encolar en el </w:t>
+      </w:r>
+      <w:r>
+        <w:rPr>
+          <w:rFonts w:ascii="Consolas" w:hAnsi="Consolas"/>
+          <w:color w:val="B03060"/>
+          <w:sz w:val="20"/>
+        </w:rPr>
+        <w:t>BatchSpanProcessor</w:t>
+      </w:r>
+      <w:r>
+        <w:t xml:space="preserve">, formatear el log JSON con </w:t>
+      </w:r>
+      <w:r>
+        <w:rPr>
+          <w:rFonts w:ascii="Consolas" w:hAnsi="Consolas"/>
+          <w:color w:val="B03060"/>
+          <w:sz w:val="20"/>
+        </w:rPr>
+        <w:t>trace_id</w:t>
+      </w:r>
+      <w:r>
+        <w:t xml:space="preserve">), ese costo no se suma de forma lineal al de un sistema no saturado: se </w:t>
+      </w:r>
+      <w:r>
+        <w:rPr>
+          <w:b/>
+        </w:rPr>
+        <w:t>amplifica</w:t>
+      </w:r>
+      <w:r>
+        <w:t xml:space="preserve"> por el efecto de cola, porque cada solicitud adicional en el hilo retrasa a todas las que están detrás. Esto explica por qué el overhead crece con el percentil (p50 +14%, p95 +25%, p99 +37%): las colas más largas (percentiles altos) son las que más sufren cualquier trabajo extra por request.</w:t>
+      </w:r>
+    </w:p>
+    <w:p>
+      <w:r>
+        <w:rPr>
+          <w:b/>
+        </w:rPr>
+        <w:t>Conclusión de diseño:</w:t>
+      </w:r>
+      <w:r>
+        <w:t xml:space="preserve"> en un servicio con I/O verdaderamente asíncrono (p. ej. </w:t>
+      </w:r>
+      <w:r>
+        <w:rPr>
+          <w:rFonts w:ascii="Consolas" w:hAnsi="Consolas"/>
+          <w:color w:val="B03060"/>
+          <w:sz w:val="20"/>
+        </w:rPr>
+        <w:t>asyncpg</w:t>
+      </w:r>
+      <w:r>
+        <w:t xml:space="preserve"> en vez de </w:t>
+      </w:r>
+      <w:r>
+        <w:rPr>
+          <w:rFonts w:ascii="Consolas" w:hAnsi="Consolas"/>
+          <w:color w:val="B03060"/>
+          <w:sz w:val="20"/>
+        </w:rPr>
+        <w:t>psycopg2</w:t>
+      </w:r>
+      <w:r>
+        <w:t xml:space="preserve">, o </w:t>
+      </w:r>
+      <w:r>
+        <w:rPr>
+          <w:rFonts w:ascii="Consolas" w:hAnsi="Consolas"/>
+          <w:color w:val="B03060"/>
+          <w:sz w:val="20"/>
+        </w:rPr>
+        <w:t>run_in_executor</w:t>
+      </w:r>
+      <w:r>
+        <w:t xml:space="preserve"> para el trabajo síncrono), se esperaría que el overhead de OTel se acerque mucho más a la cifra de referencia de la industria (3-8%), porque el event loop dejaría de ser el cuello de botella compartido que amplifica cualquier costo adicional. Este hallazgo es, en sí mismo, un ejemplo de cómo la observabilidad expone problemas de diseño que de otra forma pasarían inadvertidos con baja concurrencia.</w:t>
+      </w:r>
+    </w:p>
+    <w:p>
+      <w:pPr>
+        <w:pStyle w:val="Heading2"/>
+      </w:pPr>
+      <w:r>
+        <w:t>6.4 Limitaciones del benchmark</w:t>
+      </w:r>
+    </w:p>
+    <w:p>
+      <w:pPr>
+        <w:pStyle w:val="ListBullet"/>
+      </w:pPr>
+      <w:r>
+        <w:t xml:space="preserve">Ejecutado en una laptop de desarrollo (Docker Desktop / Windows) con otros contenedores activos simultáneamente (ver sección 6.2) — no es un entorno aislado de benchmarking. Los valores </w:t>
+      </w:r>
+      <w:r>
+        <w:rPr>
+          <w:i/>
+        </w:rPr>
+        <w:t>absolutos</w:t>
+      </w:r>
+      <w:r>
+        <w:t xml:space="preserve"> de latencia no son representativos de un despliegue real en GKE/ECS; los valores </w:t>
+      </w:r>
+      <w:r>
+        <w:rPr>
+          <w:i/>
+        </w:rPr>
+        <w:t>relativos</w:t>
+      </w:r>
+      <w:r>
+        <w:t xml:space="preserve"> (overhead %) siguen siendo la evidencia principal de este informe.</w:t>
+      </w:r>
+    </w:p>
+    <w:p>
+      <w:pPr>
+        <w:pStyle w:val="ListBullet"/>
+      </w:pPr>
+      <w:r>
+        <w:t>Solo se ejecutó una repetición por modo (no N corridas con intervalo de confianza). Para una decisión de producción se recomienda repetir cada escenario 3-5 veces.</w:t>
+      </w:r>
+    </w:p>
+    <w:p>
+      <w:pPr>
+        <w:pStyle w:val="ListBullet"/>
+      </w:pPr>
+      <w:r>
+        <w:t>La medición de CPU (6.2) viene de una corrida separada de la de latencia/throughput, por la interferencia del propio sampler descrita arriba — es una única repetición por modo, igual que la de latencia, no un promedio de múltiples corridas independientes.</w:t>
+      </w:r>
+    </w:p>
+    <w:p>
+      <w:pPr>
+        <w:pStyle w:val="Heading1"/>
+      </w:pPr>
+      <w:r>
+        <w:t>7. Infraestructura como código (IaC) y despliegue cloud</w:t>
+      </w:r>
+    </w:p>
+    <w:p>
+      <w:pPr>
+        <w:pStyle w:val="Heading2"/>
+      </w:pPr>
+      <w:r>
+        <w:t>7.1 Decisión: stack local ejecutado, IaC de nube lista pero no aplicada</w:t>
+      </w:r>
+    </w:p>
+    <w:p>
+      <w:r>
+        <w:t xml:space="preserve">Todo el pipeline (instrumentación, Collector, backends, dashboard, benchmark) se ejecutó y verificó </w:t>
+      </w:r>
+      <w:r>
+        <w:rPr>
+          <w:b/>
+        </w:rPr>
+        <w:t>localmente</w:t>
+      </w:r>
+      <w:r>
+        <w:t xml:space="preserve"> con Docker Compose. La infraestructura para GCP GKE y AWS ECS Fargate se entrega como Terraform y Helm completos y sintácticamente correctos en </w:t>
+      </w:r>
+      <w:r>
+        <w:rPr>
+          <w:rFonts w:ascii="Consolas" w:hAnsi="Consolas"/>
+          <w:color w:val="B03060"/>
+          <w:sz w:val="20"/>
+        </w:rPr>
+        <w:t>iac/</w:t>
+      </w:r>
+      <w:r>
+        <w:t xml:space="preserve">, pero </w:t>
+      </w:r>
+      <w:r>
+        <w:rPr>
+          <w:b/>
+        </w:rPr>
+        <w:t>deliberadamente no se ejecutó `terraform apply`</w:t>
+      </w:r>
+      <w:r>
+        <w:t xml:space="preserve"> contra una cuenta real, para no incurrir en costos ni requerir credenciales de nube en esta entrega. Esta decisión se tomó explícitamente al inicio del laboratorio y se documenta aquí para que quede claro que no es un olvido.</w:t>
+      </w:r>
+    </w:p>
+    <w:p>
+      <w:pPr>
+        <w:pStyle w:val="Heading2"/>
+      </w:pPr>
+      <w:r>
+        <w:t>7.2 GCP — GKE (</w:t>
+      </w:r>
+      <w:r>
+        <w:rPr>
+          <w:rFonts w:ascii="Consolas" w:hAnsi="Consolas"/>
+          <w:color w:val="B03060"/>
+          <w:sz w:val="20"/>
+        </w:rPr>
+        <w:t>iac/terraform/gcp/</w:t>
+      </w:r>
+      <w:r>
+        <w:t>)</w:t>
+      </w:r>
+    </w:p>
+    <w:p>
+      <w:r>
+        <w:t xml:space="preserve">Clúster GKE regional (VPC dedicada, no la red </w:t>
+      </w:r>
+      <w:r>
+        <w:rPr>
+          <w:rFonts w:ascii="Consolas" w:hAnsi="Consolas"/>
+          <w:color w:val="B03060"/>
+          <w:sz w:val="20"/>
+        </w:rPr>
+        <w:t>default</w:t>
+      </w:r>
+      <w:r>
+        <w:t xml:space="preserve">), Workload Identity habilitado, </w:t>
+      </w:r>
+      <w:r>
+        <w:rPr>
+          <w:rFonts w:ascii="Consolas" w:hAnsi="Consolas"/>
+          <w:color w:val="B03060"/>
+          <w:sz w:val="20"/>
+        </w:rPr>
+        <w:t>release_channel = REGULAR</w:t>
+      </w:r>
+      <w:r>
+        <w:t xml:space="preserve">, node pool con autoscaling (1-4 nodos </w:t>
+      </w:r>
+      <w:r>
+        <w:rPr>
+          <w:rFonts w:ascii="Consolas" w:hAnsi="Consolas"/>
+          <w:color w:val="B03060"/>
+          <w:sz w:val="20"/>
+        </w:rPr>
+        <w:t>e2-standard-4</w:t>
+      </w:r>
+      <w:r>
+        <w:t xml:space="preserve">). Artifact Registry para las imágenes. Los Deployments de </w:t>
+      </w:r>
+      <w:r>
+        <w:rPr>
+          <w:rFonts w:ascii="Consolas" w:hAnsi="Consolas"/>
+          <w:color w:val="B03060"/>
+          <w:sz w:val="20"/>
+        </w:rPr>
+        <w:t>service-a</w:t>
+      </w:r>
+      <w:r>
+        <w:t xml:space="preserve">, </w:t>
+      </w:r>
+      <w:r>
+        <w:rPr>
+          <w:rFonts w:ascii="Consolas" w:hAnsi="Consolas"/>
+          <w:color w:val="B03060"/>
+          <w:sz w:val="20"/>
+        </w:rPr>
+        <w:t>service-b</w:t>
+      </w:r>
+      <w:r>
+        <w:t xml:space="preserve"> y </w:t>
+      </w:r>
+      <w:r>
+        <w:rPr>
+          <w:rFonts w:ascii="Consolas" w:hAnsi="Consolas"/>
+          <w:color w:val="B03060"/>
+          <w:sz w:val="20"/>
+        </w:rPr>
+        <w:t>otel-collector</w:t>
+      </w:r>
+      <w:r>
+        <w:t xml:space="preserve"> se declaran con el provider </w:t>
+      </w:r>
+      <w:r>
+        <w:rPr>
+          <w:rFonts w:ascii="Consolas" w:hAnsi="Consolas"/>
+          <w:color w:val="B03060"/>
+          <w:sz w:val="20"/>
+        </w:rPr>
+        <w:t>kubernetes</w:t>
+      </w:r>
+      <w:r>
+        <w:t xml:space="preserve"> de Terraform, encadenado a los outputs del propio clúster (mismo archivo, sin </w:t>
+      </w:r>
+      <w:r>
+        <w:rPr>
+          <w:i/>
+        </w:rPr>
+        <w:t>hand-off</w:t>
+      </w:r>
+      <w:r>
+        <w:t xml:space="preserve"> manual a </w:t>
+      </w:r>
+      <w:r>
+        <w:rPr>
+          <w:rFonts w:ascii="Consolas" w:hAnsi="Consolas"/>
+          <w:color w:val="B03060"/>
+          <w:sz w:val="20"/>
+        </w:rPr>
+        <w:t>kubectl</w:t>
+      </w:r>
+      <w:r>
+        <w:t xml:space="preserve">). Credenciales de base de datos vía </w:t>
+      </w:r>
+      <w:r>
+        <w:rPr>
+          <w:rFonts w:ascii="Consolas" w:hAnsi="Consolas"/>
+          <w:color w:val="B03060"/>
+          <w:sz w:val="20"/>
+        </w:rPr>
+        <w:t>kubernetes_secret</w:t>
+      </w:r>
+      <w:r>
+        <w:t>, nunca en texto plano en el Deployment.</w:t>
+      </w:r>
+    </w:p>
+    <w:p>
+      <w:pPr>
+        <w:pStyle w:val="Heading2"/>
+      </w:pPr>
+      <w:r>
+        <w:t>7.3 AWS — ECS Fargate (</w:t>
+      </w:r>
+      <w:r>
+        <w:rPr>
+          <w:rFonts w:ascii="Consolas" w:hAnsi="Consolas"/>
+          <w:color w:val="B03060"/>
+          <w:sz w:val="20"/>
+        </w:rPr>
+        <w:t>iac/terraform/aws/</w:t>
+      </w:r>
+      <w:r>
+        <w:t>)</w:t>
+      </w:r>
+    </w:p>
+    <w:p>
+      <w:r>
+        <w:t xml:space="preserve">VPC mínima de 2 AZs, ECR por servicio, cluster ECS Fargate con Container Insights, ALB público hacia </w:t>
+      </w:r>
+      <w:r>
+        <w:rPr>
+          <w:rFonts w:ascii="Consolas" w:hAnsi="Consolas"/>
+          <w:color w:val="B03060"/>
+          <w:sz w:val="20"/>
+        </w:rPr>
+        <w:t>service-a:8000</w:t>
+      </w:r>
+      <w:r>
+        <w:t xml:space="preserve"> con healthcheck en </w:t>
+      </w:r>
+      <w:r>
+        <w:rPr>
+          <w:rFonts w:ascii="Consolas" w:hAnsi="Consolas"/>
+          <w:color w:val="B03060"/>
+          <w:sz w:val="20"/>
+        </w:rPr>
+        <w:t>/health</w:t>
+      </w:r>
+      <w:r>
+        <w:t xml:space="preserve">. El OTel Collector corre como </w:t>
+      </w:r>
+      <w:r>
+        <w:rPr>
+          <w:b/>
+        </w:rPr>
+        <w:t>sidecar</w:t>
+      </w:r>
+      <w:r>
+        <w:t xml:space="preserve"> dentro de cada task definition (en vez de un servicio ECS propio con Service Connect) — trade-off documentado en el propio </w:t>
+      </w:r>
+      <w:r>
+        <w:rPr>
+          <w:rFonts w:ascii="Consolas" w:hAnsi="Consolas"/>
+          <w:color w:val="B03060"/>
+          <w:sz w:val="20"/>
+        </w:rPr>
+        <w:t>main.tf</w:t>
+      </w:r>
+      <w:r>
+        <w:t xml:space="preserve">: más simple para un laboratorio (sin descubrimiento de servicios adicional, exportación por </w:t>
+      </w:r>
+      <w:r>
+        <w:rPr>
+          <w:rFonts w:ascii="Consolas" w:hAnsi="Consolas"/>
+          <w:color w:val="B03060"/>
+          <w:sz w:val="20"/>
+        </w:rPr>
+        <w:t>localhost</w:t>
+      </w:r>
+      <w:r>
+        <w:t xml:space="preserve">), a costa de correr N procesos Collector en vez de uno compartido; a mayor escala, un Collector compartido sería la elección correcta. </w:t>
+      </w:r>
+      <w:r>
+        <w:rPr>
+          <w:rFonts w:ascii="Consolas" w:hAnsi="Consolas"/>
+          <w:color w:val="B03060"/>
+          <w:sz w:val="20"/>
+        </w:rPr>
+        <w:t>service-b</w:t>
+      </w:r>
+      <w:r>
+        <w:t xml:space="preserve"> se descubre vía Cloud Map (</w:t>
+      </w:r>
+      <w:r>
+        <w:rPr>
+          <w:rFonts w:ascii="Consolas" w:hAnsi="Consolas"/>
+          <w:color w:val="B03060"/>
+          <w:sz w:val="20"/>
+        </w:rPr>
+        <w:t>service-b.&lt;namespace&gt;.local</w:t>
+      </w:r>
+      <w:r>
+        <w:t xml:space="preserve">). </w:t>
+      </w:r>
+      <w:r>
+        <w:rPr>
+          <w:rFonts w:ascii="Consolas" w:hAnsi="Consolas"/>
+          <w:color w:val="B03060"/>
+          <w:sz w:val="20"/>
+        </w:rPr>
+        <w:t>DATABASE_URL</w:t>
+      </w:r>
+      <w:r>
+        <w:t xml:space="preserve"> viaja vía AWS Secrets Manager (</w:t>
+      </w:r>
+      <w:r>
+        <w:rPr>
+          <w:rFonts w:ascii="Consolas" w:hAnsi="Consolas"/>
+          <w:color w:val="B03060"/>
+          <w:sz w:val="20"/>
+        </w:rPr>
+        <w:t>secrets</w:t>
+      </w:r>
+      <w:r>
+        <w:t xml:space="preserve"> de la task definition), con un fallback de variable plana solo para demo.</w:t>
+      </w:r>
+    </w:p>
+    <w:p>
+      <w:pPr>
+        <w:pStyle w:val="Heading2"/>
+      </w:pPr>
+      <w:r>
+        <w:t>7.4 Helm (</w:t>
+      </w:r>
+      <w:r>
+        <w:rPr>
+          <w:rFonts w:ascii="Consolas" w:hAnsi="Consolas"/>
+          <w:color w:val="B03060"/>
+          <w:sz w:val="20"/>
+        </w:rPr>
+        <w:t>iac/helm/otel-collector/</w:t>
+      </w:r>
+      <w:r>
+        <w:t>)</w:t>
+      </w:r>
+    </w:p>
+    <w:p>
+      <w:r>
+        <w:t xml:space="preserve">Chart propio (no el chart comunitario de </w:t>
+      </w:r>
+      <w:r>
+        <w:rPr>
+          <w:rFonts w:ascii="Consolas" w:hAnsi="Consolas"/>
+          <w:color w:val="B03060"/>
+          <w:sz w:val="20"/>
+        </w:rPr>
+        <w:t>open-telemetry/opentelemetry-helm-charts</w:t>
+      </w:r>
+      <w:r>
+        <w:t xml:space="preserve">, para demostrar comprensión del recurso, no solo su consumo) con Deployment + Service + ConfigMap parametrizados vía </w:t>
+      </w:r>
+      <w:r>
+        <w:rPr>
+          <w:rFonts w:ascii="Consolas" w:hAnsi="Consolas"/>
+          <w:color w:val="B03060"/>
+          <w:sz w:val="20"/>
+        </w:rPr>
+        <w:t>values.yaml</w:t>
+      </w:r>
+      <w:r>
+        <w:t xml:space="preserve"> — misma forma de pipeline (</w:t>
+      </w:r>
+      <w:r>
+        <w:rPr>
+          <w:rFonts w:ascii="Consolas" w:hAnsi="Consolas"/>
+          <w:color w:val="B03060"/>
+          <w:sz w:val="20"/>
+        </w:rPr>
+        <w:t>otlp</w:t>
+      </w:r>
+      <w:r>
+        <w:t xml:space="preserve"> → </w:t>
+      </w:r>
+      <w:r>
+        <w:rPr>
+          <w:rFonts w:ascii="Consolas" w:hAnsi="Consolas"/>
+          <w:color w:val="B03060"/>
+          <w:sz w:val="20"/>
+        </w:rPr>
+        <w:t>memory_limiter</w:t>
+      </w:r>
+      <w:r>
+        <w:t>/</w:t>
+      </w:r>
+      <w:r>
+        <w:rPr>
+          <w:rFonts w:ascii="Consolas" w:hAnsi="Consolas"/>
+          <w:color w:val="B03060"/>
+          <w:sz w:val="20"/>
+        </w:rPr>
+        <w:t>batch</w:t>
+      </w:r>
+      <w:r>
+        <w:t>/</w:t>
+      </w:r>
+      <w:r>
+        <w:rPr>
+          <w:rFonts w:ascii="Consolas" w:hAnsi="Consolas"/>
+          <w:color w:val="B03060"/>
+          <w:sz w:val="20"/>
+        </w:rPr>
+        <w:t>resource</w:t>
+      </w:r>
+      <w:r>
+        <w:t xml:space="preserve"> → exporters) que la variante local, pero con exporters dejados como placeholders para que cada entorno los sobrescriba sin tocar el chart. Validado con </w:t>
+      </w:r>
+      <w:r>
+        <w:rPr>
+          <w:rFonts w:ascii="Consolas" w:hAnsi="Consolas"/>
+          <w:color w:val="B03060"/>
+          <w:sz w:val="20"/>
+        </w:rPr>
+        <w:t>helm lint</w:t>
+      </w:r>
+      <w:r>
+        <w:t xml:space="preserve"> y </w:t>
+      </w:r>
+      <w:r>
+        <w:rPr>
+          <w:rFonts w:ascii="Consolas" w:hAnsi="Consolas"/>
+          <w:color w:val="B03060"/>
+          <w:sz w:val="20"/>
+        </w:rPr>
+        <w:t>helm template</w:t>
+      </w:r>
+      <w:r>
+        <w:t xml:space="preserve"> (sin clúster real disponible en este entorno de desarrollo).</w:t>
+      </w:r>
+    </w:p>
+    <w:p>
+      <w:pPr>
+        <w:pStyle w:val="Heading1"/>
+      </w:pPr>
+      <w:r>
+        <w:t>8. Lecciones aprendidas (troubleshooting real)</w:t>
+      </w:r>
+    </w:p>
+    <w:p>
+      <w:r>
+        <w:t>Tres problemas de instrumentación reales aparecieron solo al ejecutar el sistema, no al leer la documentación de OTel — se documentan porque son justamente el tipo de conocimiento que un ejercicio puramente teórico no puede enseñar.</w:t>
+      </w:r>
+    </w:p>
+    <w:p>
+      <w:r>
+        <w:rPr>
+          <w:b/>
+        </w:rPr>
+        <w:t>1. `FastAPIInstrumentor().instrument()` global no propagaba el trace_id.</w:t>
+      </w:r>
+      <w:r>
+        <w:t xml:space="preserve"> El patrón "instrumentar antes de crear la app" (llamar </w:t>
+      </w:r>
+      <w:r>
+        <w:rPr>
+          <w:rFonts w:ascii="Consolas" w:hAnsi="Consolas"/>
+          <w:color w:val="B03060"/>
+          <w:sz w:val="20"/>
+        </w:rPr>
+        <w:t>FastAPIInstrumentor().instrument(tracer_provider=...)</w:t>
+      </w:r>
+      <w:r>
+        <w:t xml:space="preserve"> sin argumento </w:t>
+      </w:r>
+      <w:r>
+        <w:rPr>
+          <w:rFonts w:ascii="Consolas" w:hAnsi="Consolas"/>
+          <w:color w:val="B03060"/>
+          <w:sz w:val="20"/>
+        </w:rPr>
+        <w:t>app</w:t>
+      </w:r>
+      <w:r>
+        <w:t xml:space="preserve">, confiando en que parchea </w:t>
+      </w:r>
+      <w:r>
+        <w:rPr>
+          <w:rFonts w:ascii="Consolas" w:hAnsi="Consolas"/>
+          <w:color w:val="B03060"/>
+          <w:sz w:val="20"/>
+        </w:rPr>
+        <w:t>FastAPI.__init__</w:t>
+      </w:r>
+      <w:r>
+        <w:t xml:space="preserve"> globalmente) resultó poco fiable en la práctica: cada span de negocio (</w:t>
+      </w:r>
+      <w:r>
+        <w:rPr>
+          <w:rFonts w:ascii="Consolas" w:hAnsi="Consolas"/>
+          <w:color w:val="B03060"/>
+          <w:sz w:val="20"/>
+        </w:rPr>
+        <w:t>order.fetch_from_db</w:t>
+      </w:r>
+      <w:r>
+        <w:t xml:space="preserve">, </w:t>
+      </w:r>
+      <w:r>
+        <w:rPr>
+          <w:rFonts w:ascii="Consolas" w:hAnsi="Consolas"/>
+          <w:color w:val="B03060"/>
+          <w:sz w:val="20"/>
+        </w:rPr>
+        <w:t>order.check_inventory</w:t>
+      </w:r>
+      <w:r>
+        <w:t xml:space="preserve">) terminaba como </w:t>
+      </w:r>
+      <w:r>
+        <w:rPr>
+          <w:i/>
+        </w:rPr>
+        <w:t>raíz</w:t>
+      </w:r>
+      <w:r>
+        <w:t xml:space="preserve"> de su propio trace en vez de colgar del span del servidor HTTP, y </w:t>
+      </w:r>
+      <w:r>
+        <w:rPr>
+          <w:rFonts w:ascii="Consolas" w:hAnsi="Consolas"/>
+          <w:color w:val="B03060"/>
+          <w:sz w:val="20"/>
+        </w:rPr>
+        <w:t>trace_id</w:t>
+      </w:r>
+      <w:r>
+        <w:t xml:space="preserve"> en la respuesta JSON salía en </w:t>
+      </w:r>
+      <w:r>
+        <w:rPr>
+          <w:rFonts w:ascii="Consolas" w:hAnsi="Consolas"/>
+          <w:color w:val="B03060"/>
+          <w:sz w:val="20"/>
+        </w:rPr>
+        <w:t>00000000000000000000000000000000</w:t>
+      </w:r>
+      <w:r>
+        <w:t xml:space="preserve"> (span inválido). La corrección fue usar el patrón explícito </w:t>
+      </w:r>
+      <w:r>
+        <w:rPr>
+          <w:rFonts w:ascii="Consolas" w:hAnsi="Consolas"/>
+          <w:color w:val="B03060"/>
+          <w:sz w:val="20"/>
+        </w:rPr>
+        <w:t>FastAPIInstrumentor.instrument_app(app, ...)</w:t>
+      </w:r>
+      <w:r>
+        <w:t xml:space="preserve"> justo después de </w:t>
+      </w:r>
+      <w:r>
+        <w:rPr>
+          <w:rFonts w:ascii="Consolas" w:hAnsi="Consolas"/>
+          <w:color w:val="B03060"/>
+          <w:sz w:val="20"/>
+        </w:rPr>
+        <w:t>app = FastAPI(...)</w:t>
+      </w:r>
+      <w:r>
+        <w:t xml:space="preserve"> en </w:t>
+      </w:r>
+      <w:r>
+        <w:rPr>
+          <w:rFonts w:ascii="Consolas" w:hAnsi="Consolas"/>
+          <w:color w:val="B03060"/>
+          <w:sz w:val="20"/>
+        </w:rPr>
+        <w:t>main.py</w:t>
+      </w:r>
+      <w:r>
+        <w:t xml:space="preserve"> — documentado con un comentario en </w:t>
+      </w:r>
+      <w:r>
+        <w:rPr>
+          <w:rFonts w:ascii="Consolas" w:hAnsi="Consolas"/>
+          <w:color w:val="B03060"/>
+          <w:sz w:val="20"/>
+        </w:rPr>
+        <w:t>telemetry.py</w:t>
+      </w:r>
+      <w:r>
+        <w:t xml:space="preserve"> para que no se repita el error.</w:t>
+      </w:r>
+    </w:p>
+    <w:p>
+      <w:r>
+        <w:rPr>
+          <w:b/>
+        </w:rPr>
+        <w:t>2. El filtro de `/health` en el Collector no bastaba.</w:t>
+      </w:r>
+      <w:r>
+        <w:t xml:space="preserve"> El middleware ASGI de FastAPI genera spans internos por cada evento (</w:t>
+      </w:r>
+      <w:r>
+        <w:rPr>
+          <w:rFonts w:ascii="Consolas" w:hAnsi="Consolas"/>
+          <w:color w:val="B03060"/>
+          <w:sz w:val="20"/>
+        </w:rPr>
+        <w:t>http send</w:t>
+      </w:r>
+      <w:r>
+        <w:t xml:space="preserve">, </w:t>
+      </w:r>
+      <w:r>
+        <w:rPr>
+          <w:rFonts w:ascii="Consolas" w:hAnsi="Consolas"/>
+          <w:color w:val="B03060"/>
+          <w:sz w:val="20"/>
+        </w:rPr>
+        <w:t>http receive</w:t>
+      </w:r>
+      <w:r>
+        <w:t xml:space="preserve">) además del span raíz del endpoint. El processor </w:t>
+      </w:r>
+      <w:r>
+        <w:rPr>
+          <w:rFonts w:ascii="Consolas" w:hAnsi="Consolas"/>
+          <w:color w:val="B03060"/>
+          <w:sz w:val="20"/>
+        </w:rPr>
+        <w:t>filter/health</w:t>
+      </w:r>
+      <w:r>
+        <w:t xml:space="preserve"> del Collector (que descarta por el atributo </w:t>
+      </w:r>
+      <w:r>
+        <w:rPr>
+          <w:rFonts w:ascii="Consolas" w:hAnsi="Consolas"/>
+          <w:color w:val="B03060"/>
+          <w:sz w:val="20"/>
+        </w:rPr>
+        <w:t>http.target == "/health"</w:t>
+      </w:r>
+      <w:r>
+        <w:t xml:space="preserve">) solo alcanza al span raíz — los spans internos de evento no llevan ese atributo, así que igual llegaban a Jaeger como trazas huérfanas (con </w:t>
+      </w:r>
+      <w:r>
+        <w:rPr>
+          <w:rFonts w:ascii="Consolas" w:hAnsi="Consolas"/>
+          <w:color w:val="B03060"/>
+          <w:sz w:val="20"/>
+        </w:rPr>
+        <w:t>trace_id</w:t>
+      </w:r>
+      <w:r>
+        <w:t xml:space="preserve"> propio, sin span padre visible). La solución correcta es evitar que esos spans se </w:t>
+      </w:r>
+      <w:r>
+        <w:rPr>
+          <w:b/>
+        </w:rPr>
+        <w:t>creen</w:t>
+      </w:r>
+      <w:r>
+        <w:t xml:space="preserve">, no filtrarlos después: </w:t>
+      </w:r>
+      <w:r>
+        <w:rPr>
+          <w:rFonts w:ascii="Consolas" w:hAnsi="Consolas"/>
+          <w:color w:val="B03060"/>
+          <w:sz w:val="20"/>
+        </w:rPr>
+        <w:t>FastAPIInstrumentor.instrument_app(app, excluded_urls="/health", ...)</w:t>
+      </w:r>
+      <w:r>
+        <w:t xml:space="preserve">. El processor </w:t>
+      </w:r>
+      <w:r>
+        <w:rPr>
+          <w:rFonts w:ascii="Consolas" w:hAnsi="Consolas"/>
+          <w:color w:val="B03060"/>
+          <w:sz w:val="20"/>
+        </w:rPr>
+        <w:t>filter/health</w:t>
+      </w:r>
+      <w:r>
+        <w:t xml:space="preserve"> del Collector se dejó como segunda capa de defensa (para servicios que no puedan excluir por SDK), pero ya no es la única línea de defensa.</w:t>
+      </w:r>
+    </w:p>
+    <w:p>
+      <w:r>
+        <w:rPr>
+          <w:b/>
+        </w:rPr>
+        <w:t>3. Los histogramas de latencia daban un p95 fantasma de ~4.75 segundos.</w:t>
+      </w:r>
+      <w:r>
+        <w:t xml:space="preserve"> Al poblar el dashboard con tráfico real, el panel "Latencia p95" mostraba consistentemente ~4750ms, aunque una petición manual cronometrada tardaba 43ms. Causa: </w:t>
+      </w:r>
+      <w:r>
+        <w:rPr>
+          <w:rFonts w:ascii="Consolas" w:hAnsi="Consolas"/>
+          <w:color w:val="B03060"/>
+          <w:sz w:val="20"/>
+        </w:rPr>
+        <w:t>meter.create_histogram(...)</w:t>
+      </w:r>
+      <w:r>
+        <w:t xml:space="preserve"> se llamó sin especificar </w:t>
+      </w:r>
+      <w:r>
+        <w:rPr>
+          <w:i/>
+        </w:rPr>
+        <w:t>bucket boundaries</w:t>
+      </w:r>
+      <w:r>
+        <w:t xml:space="preserve"> explícitos, así que el SDK usa los valores por defecto </w:t>
+      </w:r>
+      <w:r>
+        <w:rPr>
+          <w:rFonts w:ascii="Consolas" w:hAnsi="Consolas"/>
+          <w:color w:val="B03060"/>
+          <w:sz w:val="20"/>
+        </w:rPr>
+        <w:t>(0, 5, 10, 25, 50, 75, 100, 250, 500, 750, 1000, 2500, 5000, 7500, 10000)</w:t>
+      </w:r>
+      <w:r>
+        <w:t xml:space="preserve"> — pensados para mediciones en </w:t>
+      </w:r>
+      <w:r>
+        <w:rPr>
+          <w:b/>
+        </w:rPr>
+        <w:t>milisegundos</w:t>
+      </w:r>
+      <w:r>
+        <w:t xml:space="preserve">. Pero el código mide en </w:t>
+      </w:r>
+      <w:r>
+        <w:rPr>
+          <w:b/>
+        </w:rPr>
+        <w:t>segundos</w:t>
+      </w:r>
+      <w:r>
+        <w:t xml:space="preserve"> (</w:t>
+      </w:r>
+      <w:r>
+        <w:rPr>
+          <w:rFonts w:ascii="Consolas" w:hAnsi="Consolas"/>
+          <w:color w:val="B03060"/>
+          <w:sz w:val="20"/>
+        </w:rPr>
+        <w:t>duration = time.time() - start</w:t>
+      </w:r>
+      <w:r>
+        <w:t xml:space="preserve">, valores como </w:t>
+      </w:r>
+      <w:r>
+        <w:rPr>
+          <w:rFonts w:ascii="Consolas" w:hAnsi="Consolas"/>
+          <w:color w:val="B03060"/>
+          <w:sz w:val="20"/>
+        </w:rPr>
+        <w:t>0.043</w:t>
+      </w:r>
+      <w:r>
+        <w:t>), así que absolutamente todas las observaciones caían en el primer bucket no vacío (</w:t>
+      </w:r>
+      <w:r>
+        <w:rPr>
+          <w:rFonts w:ascii="Consolas" w:hAnsi="Consolas"/>
+          <w:color w:val="B03060"/>
+          <w:sz w:val="20"/>
+        </w:rPr>
+        <w:t>le=5.0</w:t>
+      </w:r>
+      <w:r>
+        <w:t xml:space="preserve">, es decir, "≤ 5 segundos") sin ningún bucket intermedio que las distinguiera. Con un único escalón informativo, </w:t>
+      </w:r>
+      <w:r>
+        <w:rPr>
+          <w:rFonts w:ascii="Consolas" w:hAnsi="Consolas"/>
+          <w:color w:val="B03060"/>
+          <w:sz w:val="20"/>
+        </w:rPr>
+        <w:t>histogram_quantile</w:t>
+      </w:r>
+      <w:r>
+        <w:t xml:space="preserve"> interpola linealmente entre 0 y 5.0 para estimar el percentil 95, dando ~4.75 — un artefacto matemático, no una medición real. Verificado inspeccionando los buckets crudos vía la API de Prometheus (</w:t>
+      </w:r>
+      <w:r>
+        <w:rPr>
+          <w:rFonts w:ascii="Consolas" w:hAnsi="Consolas"/>
+          <w:color w:val="B03060"/>
+          <w:sz w:val="20"/>
+        </w:rPr>
+        <w:t>http_request_duration_seconds_bucket</w:t>
+      </w:r>
+      <w:r>
+        <w:t xml:space="preserve">): 691 observaciones repartidas en </w:t>
+      </w:r>
+      <w:r>
+        <w:rPr>
+          <w:rFonts w:ascii="Consolas" w:hAnsi="Consolas"/>
+          <w:color w:val="B03060"/>
+          <w:sz w:val="20"/>
+        </w:rPr>
+        <w:t>le=0.0 → 0</w:t>
+      </w:r>
+      <w:r>
+        <w:t xml:space="preserve"> y </w:t>
+      </w:r>
+      <w:r>
+        <w:rPr>
+          <w:rFonts w:ascii="Consolas" w:hAnsi="Consolas"/>
+          <w:color w:val="B03060"/>
+          <w:sz w:val="20"/>
+        </w:rPr>
+        <w:t>le=5.0 → 691</w:t>
+      </w:r>
+      <w:r>
+        <w:t>, sin nada entre medio.</w:t>
+      </w:r>
+    </w:p>
+    <w:p>
+      <w:r>
+        <w:t xml:space="preserve">La corrección fue registrar un </w:t>
+      </w:r>
+      <w:r>
+        <w:rPr>
+          <w:rFonts w:ascii="Consolas" w:hAnsi="Consolas"/>
+          <w:color w:val="B03060"/>
+          <w:sz w:val="20"/>
+        </w:rPr>
+        <w:t>View</w:t>
+      </w:r>
+      <w:r>
+        <w:t xml:space="preserve"> con </w:t>
+      </w:r>
+      <w:r>
+        <w:rPr>
+          <w:rFonts w:ascii="Consolas" w:hAnsi="Consolas"/>
+          <w:color w:val="B03060"/>
+          <w:sz w:val="20"/>
+        </w:rPr>
+        <w:t>ExplicitBucketHistogramAggregation</w:t>
+      </w:r>
+      <w:r>
+        <w:t xml:space="preserve"> sobre todos los instrumentos </w:t>
+      </w:r>
+      <w:r>
+        <w:rPr>
+          <w:rFonts w:ascii="Consolas" w:hAnsi="Consolas"/>
+          <w:color w:val="B03060"/>
+          <w:sz w:val="20"/>
+        </w:rPr>
+        <w:t>*_seconds</w:t>
+      </w:r>
+      <w:r>
+        <w:t>, con los boundaries clásicos de Prometheus en segundos (</w:t>
+      </w:r>
+      <w:r>
+        <w:rPr>
+          <w:rFonts w:ascii="Consolas" w:hAnsi="Consolas"/>
+          <w:color w:val="B03060"/>
+          <w:sz w:val="20"/>
+        </w:rPr>
+        <w:t>0.005, 0.01, 0.025, ..., 7.5, 10</w:t>
+      </w:r>
+      <w:r>
+        <w:t xml:space="preserve">) — ver </w:t>
+      </w:r>
+      <w:r>
+        <w:rPr>
+          <w:rFonts w:ascii="Consolas" w:hAnsi="Consolas"/>
+          <w:color w:val="B03060"/>
+          <w:sz w:val="20"/>
+        </w:rPr>
+        <w:t>services/*/app/telemetry.py</w:t>
+      </w:r>
+      <w:r>
+        <w:t>. Tras el fix, el mismo tráfico mostró 25 de 30 requests entre 25-50ms y un p95 real de ~48ms, coherente con la medición manual.</w:t>
+      </w:r>
+    </w:p>
+    <w:p>
+      <w:r>
+        <w:t xml:space="preserve">Este bug es fácil de cometer y fácil de no notar: el dashboard "funcionaba" (mostraba un número, con unidad, con color) — solo estaba mal. Es un recordatorio de que un panel con datos no es lo mismo que un panel con datos </w:t>
+      </w:r>
+      <w:r>
+        <w:rPr>
+          <w:i/>
+        </w:rPr>
+        <w:t>correctos</w:t>
+      </w:r>
+      <w:r>
+        <w:t>, y de que vale la pena cruzar al menos una vez el número que muestra un dashboard contra una medición manual independiente.</w:t>
+      </w:r>
+    </w:p>
+    <w:p>
+      <w:pPr>
+        <w:pStyle w:val="Heading1"/>
+      </w:pPr>
+      <w:r>
+        <w:t>9. Trabajo futuro</w:t>
+      </w:r>
+    </w:p>
+    <w:p>
+      <w:pPr>
+        <w:pStyle w:val="ListBullet"/>
+      </w:pPr>
+      <w:r>
+        <w:t xml:space="preserve">Migrar el acceso a PostgreSQL a </w:t>
+      </w:r>
+      <w:r>
+        <w:rPr>
+          <w:rFonts w:ascii="Consolas" w:hAnsi="Consolas"/>
+          <w:color w:val="B03060"/>
+          <w:sz w:val="20"/>
+        </w:rPr>
+        <w:t>asyncpg</w:t>
+      </w:r>
+      <w:r>
+        <w:t xml:space="preserve"> (o </w:t>
+      </w:r>
+      <w:r>
+        <w:rPr>
+          <w:rFonts w:ascii="Consolas" w:hAnsi="Consolas"/>
+          <w:color w:val="B03060"/>
+          <w:sz w:val="20"/>
+        </w:rPr>
+        <w:t>run_in_executor</w:t>
+      </w:r>
+      <w:r>
+        <w:t>) para eliminar el bloqueo del event loop identificado en 6.3 y repetir el benchmark — la hipótesis es que el overhead relativo de OTel bajaría a un solo dígito porcentual.</w:t>
+      </w:r>
+    </w:p>
+    <w:p>
+      <w:pPr>
+        <w:pStyle w:val="ListBullet"/>
+      </w:pPr>
+      <w:r>
+        <w:rPr>
+          <w:rFonts w:ascii="Consolas" w:hAnsi="Consolas"/>
+          <w:color w:val="B03060"/>
+          <w:sz w:val="20"/>
+        </w:rPr>
+        <w:t>tail_sampling</w:t>
+      </w:r>
+      <w:r>
+        <w:t xml:space="preserve"> en el Collector (muestrear el 100% de las trazas con error o latencia alta, y un porcentaje menor del resto) para reducir volumen sin perder señal, una vez el sistema tenga tráfico de producción real.</w:t>
+      </w:r>
+    </w:p>
+    <w:p>
+      <w:pPr>
+        <w:pStyle w:val="ListBullet"/>
+      </w:pPr>
+      <w:r>
+        <w:t>Ejecutar el benchmark en un entorno aislado (no una laptop de desarrollo compartida) y con múltiples repeticiones, para obtener intervalos de confianza sobre el overhead de CPU y de latencia (hoy: una sola corrida por modo para cada uno).</w:t>
+      </w:r>
+    </w:p>
+    <w:p>
+      <w:pPr>
+        <w:pStyle w:val="ListBullet"/>
+      </w:pPr>
+      <w:r>
+        <w:t xml:space="preserve">Medir CPU y latencia en la misma corrida sin interferencia mutua (por ejemplo, muestreando CPU desde </w:t>
+      </w:r>
+      <w:r>
+        <w:rPr>
+          <w:rFonts w:ascii="Consolas" w:hAnsi="Consolas"/>
+          <w:color w:val="B03060"/>
+          <w:sz w:val="20"/>
+        </w:rPr>
+        <w:t>cgroup cpu.stat</w:t>
+      </w:r>
+      <w:r>
+        <w:t xml:space="preserve"> dentro del propio contenedor en vez de </w:t>
       </w:r>
       <w:r>
         <w:rPr>
@@ -3581,1207 +5437,7 @@
         <w:t>docker stats</w:t>
       </w:r>
       <w:r>
-        <w:t xml:space="preserve"> muestreado cada segundo y promediado, o </w:t>
-      </w:r>
-      <w:r>
-        <w:rPr>
-          <w:rFonts w:ascii="Consolas" w:hAnsi="Consolas"/>
-          <w:color w:val="B03060"/>
-          <w:sz w:val="20"/>
-        </w:rPr>
-        <w:t>cgroup cpu.stat</w:t>
-      </w:r>
-      <w:r>
-        <w:t xml:space="preserve"> antes/después), no snapshots puntuales — queda como trabajo futuro (sección 9).</w:t>
-      </w:r>
-    </w:p>
-    <w:p>
-      <w:pPr>
-        <w:pStyle w:val="Heading2"/>
-      </w:pPr>
-      <w:r>
-        <w:t>6.3 Interpretación: por qué el overhead es más alto que la referencia de la industria</w:t>
-      </w:r>
-    </w:p>
-    <w:p>
-      <w:r>
-        <w:t xml:space="preserve">El material de la actividad cita un overhead de referencia de p99 &lt; 10ms como aceptable. Lo medido aquí (+518ms en p99) es un orden de magnitud mayor. La causa identificada </w:t>
-      </w:r>
-      <w:r>
-        <w:rPr>
-          <w:b/>
-        </w:rPr>
-        <w:t>no es el SDK de OTel en sí</w:t>
-      </w:r>
-      <w:r>
-        <w:t xml:space="preserve">, sino una decisión de arquitectura de la aplicación: </w:t>
-      </w:r>
-      <w:r>
-        <w:rPr>
-          <w:rFonts w:ascii="Consolas" w:hAnsi="Consolas"/>
-          <w:color w:val="B03060"/>
-          <w:sz w:val="20"/>
-        </w:rPr>
-        <w:t>services/*/app/main.py</w:t>
-      </w:r>
-      <w:r>
-        <w:t xml:space="preserve"> y </w:t>
-      </w:r>
-      <w:r>
-        <w:rPr>
-          <w:rFonts w:ascii="Consolas" w:hAnsi="Consolas"/>
-          <w:color w:val="B03060"/>
-          <w:sz w:val="20"/>
-        </w:rPr>
-        <w:t>db.py</w:t>
-      </w:r>
-      <w:r>
-        <w:t xml:space="preserve"> usan </w:t>
-      </w:r>
-      <w:r>
-        <w:rPr>
-          <w:rFonts w:ascii="Consolas" w:hAnsi="Consolas"/>
-          <w:color w:val="B03060"/>
-          <w:sz w:val="20"/>
-        </w:rPr>
-        <w:t>psycopg2</w:t>
-      </w:r>
-      <w:r>
-        <w:t xml:space="preserve"> (síncrono) y </w:t>
-      </w:r>
-      <w:r>
-        <w:rPr>
-          <w:rFonts w:ascii="Consolas" w:hAnsi="Consolas"/>
-          <w:color w:val="B03060"/>
-          <w:sz w:val="20"/>
-        </w:rPr>
-        <w:t>time.sleep()</w:t>
-      </w:r>
-      <w:r>
-        <w:t xml:space="preserve"> dentro de funciones </w:t>
-      </w:r>
-      <w:r>
-        <w:rPr>
-          <w:rFonts w:ascii="Consolas" w:hAnsi="Consolas"/>
-          <w:color w:val="B03060"/>
-          <w:sz w:val="20"/>
-        </w:rPr>
-        <w:t>async def</w:t>
-      </w:r>
-      <w:r>
-        <w:t xml:space="preserve">, sin desviarlos a un </w:t>
-      </w:r>
-      <w:r>
-        <w:rPr>
-          <w:i/>
-        </w:rPr>
-        <w:t>thread pool</w:t>
-      </w:r>
-      <w:r>
-        <w:t xml:space="preserve"> (</w:t>
-      </w:r>
-      <w:r>
-        <w:rPr>
-          <w:rFonts w:ascii="Consolas" w:hAnsi="Consolas"/>
-          <w:color w:val="B03060"/>
-          <w:sz w:val="20"/>
-        </w:rPr>
-        <w:t>run_in_executor</w:t>
-      </w:r>
-      <w:r>
-        <w:t>) ni usar un driver async (</w:t>
-      </w:r>
-      <w:r>
-        <w:rPr>
-          <w:rFonts w:ascii="Consolas" w:hAnsi="Consolas"/>
-          <w:color w:val="B03060"/>
-          <w:sz w:val="20"/>
-        </w:rPr>
-        <w:t>asyncpg</w:t>
-      </w:r>
-      <w:r>
-        <w:t xml:space="preserve">). Cada consulta bloquea el </w:t>
-      </w:r>
-      <w:r>
-        <w:rPr>
-          <w:i/>
-        </w:rPr>
-        <w:t>único</w:t>
-      </w:r>
-      <w:r>
-        <w:t xml:space="preserve"> hilo del event loop de </w:t>
-      </w:r>
-      <w:r>
-        <w:rPr>
-          <w:rFonts w:ascii="Consolas" w:hAnsi="Consolas"/>
-          <w:color w:val="B03060"/>
-          <w:sz w:val="20"/>
-        </w:rPr>
-        <w:t>uvicorn</w:t>
-      </w:r>
-      <w:r>
-        <w:t xml:space="preserve"> durante 8-150ms.</w:t>
-      </w:r>
-    </w:p>
-    <w:p>
-      <w:r>
-        <w:t xml:space="preserve">Bajo 60 VUs concurrentes, ese bloqueo ya genera una cola de requests esperando el hilo (de ahí la latencia base alta, ~1060ms, incluso sin OTel). Cuando se añade el trabajo síncrono adicional de OTel en el mismo hilo (construir spans, serializar atributos, encolar en el </w:t>
-      </w:r>
-      <w:r>
-        <w:rPr>
-          <w:rFonts w:ascii="Consolas" w:hAnsi="Consolas"/>
-          <w:color w:val="B03060"/>
-          <w:sz w:val="20"/>
-        </w:rPr>
-        <w:t>BatchSpanProcessor</w:t>
-      </w:r>
-      <w:r>
-        <w:t xml:space="preserve">, formatear el log JSON con </w:t>
-      </w:r>
-      <w:r>
-        <w:rPr>
-          <w:rFonts w:ascii="Consolas" w:hAnsi="Consolas"/>
-          <w:color w:val="B03060"/>
-          <w:sz w:val="20"/>
-        </w:rPr>
-        <w:t>trace_id</w:t>
-      </w:r>
-      <w:r>
-        <w:t xml:space="preserve">), ese costo no se suma de forma lineal al de un sistema no saturado: se </w:t>
-      </w:r>
-      <w:r>
-        <w:rPr>
-          <w:b/>
-        </w:rPr>
-        <w:t>amplifica</w:t>
-      </w:r>
-      <w:r>
-        <w:t xml:space="preserve"> por el efecto de cola, porque cada solicitud adicional en el hilo retrasa a todas las que están detrás. Esto explica por qué el overhead crece con el percentil (p50 +14%, p95 +25%, p99 +37%): las colas más largas (percentiles altos) son las que más sufren cualquier trabajo extra por request.</w:t>
-      </w:r>
-    </w:p>
-    <w:p>
-      <w:r>
-        <w:rPr>
-          <w:b/>
-        </w:rPr>
-        <w:t>Conclusión de diseño:</w:t>
-      </w:r>
-      <w:r>
-        <w:t xml:space="preserve"> en un servicio con I/O verdaderamente asíncrono (p. ej. </w:t>
-      </w:r>
-      <w:r>
-        <w:rPr>
-          <w:rFonts w:ascii="Consolas" w:hAnsi="Consolas"/>
-          <w:color w:val="B03060"/>
-          <w:sz w:val="20"/>
-        </w:rPr>
-        <w:t>asyncpg</w:t>
-      </w:r>
-      <w:r>
-        <w:t xml:space="preserve"> en vez de </w:t>
-      </w:r>
-      <w:r>
-        <w:rPr>
-          <w:rFonts w:ascii="Consolas" w:hAnsi="Consolas"/>
-          <w:color w:val="B03060"/>
-          <w:sz w:val="20"/>
-        </w:rPr>
-        <w:t>psycopg2</w:t>
-      </w:r>
-      <w:r>
-        <w:t xml:space="preserve">, o </w:t>
-      </w:r>
-      <w:r>
-        <w:rPr>
-          <w:rFonts w:ascii="Consolas" w:hAnsi="Consolas"/>
-          <w:color w:val="B03060"/>
-          <w:sz w:val="20"/>
-        </w:rPr>
-        <w:t>run_in_executor</w:t>
-      </w:r>
-      <w:r>
-        <w:t xml:space="preserve"> para el trabajo síncrono), se esperaría que el overhead de OTel se acerque mucho más a la cifra de referencia de la industria (3-8%), porque el event loop dejaría de ser el cuello de botella compartido que amplifica cualquier costo adicional. Este hallazgo es, en sí mismo, un ejemplo de cómo la observabilidad expone problemas de diseño que de otra forma pasarían inadvertidos con baja concurrencia.</w:t>
-      </w:r>
-    </w:p>
-    <w:p>
-      <w:pPr>
-        <w:pStyle w:val="Heading2"/>
-      </w:pPr>
-      <w:r>
-        <w:t>6.4 Limitaciones del benchmark</w:t>
-      </w:r>
-    </w:p>
-    <w:p>
-      <w:pPr>
-        <w:pStyle w:val="ListBullet"/>
-      </w:pPr>
-      <w:r>
-        <w:t xml:space="preserve">Ejecutado en una laptop de desarrollo (Docker Desktop / Windows) con otros contenedores activos simultáneamente (ver sección 6.2) — no es un entorno aislado de benchmarking. Los valores </w:t>
-      </w:r>
-      <w:r>
-        <w:rPr>
-          <w:i/>
-        </w:rPr>
-        <w:t>absolutos</w:t>
-      </w:r>
-      <w:r>
-        <w:t xml:space="preserve"> de latencia no son representativos de un despliegue real en GKE/ECS; los valores </w:t>
-      </w:r>
-      <w:r>
-        <w:rPr>
-          <w:i/>
-        </w:rPr>
-        <w:t>relativos</w:t>
-      </w:r>
-      <w:r>
-        <w:t xml:space="preserve"> (overhead %) siguen siendo la evidencia principal de este informe.</w:t>
-      </w:r>
-    </w:p>
-    <w:p>
-      <w:pPr>
-        <w:pStyle w:val="ListBullet"/>
-      </w:pPr>
-      <w:r>
-        <w:t>Solo se ejecutó una repetición por modo (no N corridas con intervalo de confianza). Para una decisión de producción se recomienda repetir cada escenario 3-5 veces.</w:t>
-      </w:r>
-    </w:p>
-    <w:p>
-      <w:pPr>
-        <w:pStyle w:val="Heading1"/>
-      </w:pPr>
-      <w:r>
-        <w:t>7. Infraestructura como código (IaC) y despliegue cloud</w:t>
-      </w:r>
-    </w:p>
-    <w:p>
-      <w:pPr>
-        <w:pStyle w:val="Heading2"/>
-      </w:pPr>
-      <w:r>
-        <w:t>7.1 Decisión: stack local ejecutado, IaC de nube lista pero no aplicada</w:t>
-      </w:r>
-    </w:p>
-    <w:p>
-      <w:r>
-        <w:t xml:space="preserve">Todo el pipeline (instrumentación, Collector, backends, dashboard, benchmark) se ejecutó y verificó </w:t>
-      </w:r>
-      <w:r>
-        <w:rPr>
-          <w:b/>
-        </w:rPr>
-        <w:t>localmente</w:t>
-      </w:r>
-      <w:r>
-        <w:t xml:space="preserve"> con Docker Compose. La infraestructura para GCP GKE y AWS ECS Fargate se entrega como Terraform y Helm completos y sintácticamente correctos en </w:t>
-      </w:r>
-      <w:r>
-        <w:rPr>
-          <w:rFonts w:ascii="Consolas" w:hAnsi="Consolas"/>
-          <w:color w:val="B03060"/>
-          <w:sz w:val="20"/>
-        </w:rPr>
-        <w:t>iac/</w:t>
-      </w:r>
-      <w:r>
-        <w:t xml:space="preserve">, pero </w:t>
-      </w:r>
-      <w:r>
-        <w:rPr>
-          <w:b/>
-        </w:rPr>
-        <w:t>deliberadamente no se ejecutó `terraform apply`</w:t>
-      </w:r>
-      <w:r>
-        <w:t xml:space="preserve"> contra una cuenta real, para no incurrir en costos ni requerir credenciales de nube en esta entrega. Esta decisión se tomó explícitamente al inicio del laboratorio y se documenta aquí para que quede claro que no es un olvido.</w:t>
-      </w:r>
-    </w:p>
-    <w:p>
-      <w:pPr>
-        <w:pStyle w:val="Heading2"/>
-      </w:pPr>
-      <w:r>
-        <w:t>7.2 GCP — GKE (</w:t>
-      </w:r>
-      <w:r>
-        <w:rPr>
-          <w:rFonts w:ascii="Consolas" w:hAnsi="Consolas"/>
-          <w:color w:val="B03060"/>
-          <w:sz w:val="20"/>
-        </w:rPr>
-        <w:t>iac/terraform/gcp/</w:t>
-      </w:r>
-      <w:r>
-        <w:t>)</w:t>
-      </w:r>
-    </w:p>
-    <w:p>
-      <w:r>
-        <w:t xml:space="preserve">Clúster GKE regional (VPC dedicada, no la red </w:t>
-      </w:r>
-      <w:r>
-        <w:rPr>
-          <w:rFonts w:ascii="Consolas" w:hAnsi="Consolas"/>
-          <w:color w:val="B03060"/>
-          <w:sz w:val="20"/>
-        </w:rPr>
-        <w:t>default</w:t>
-      </w:r>
-      <w:r>
-        <w:t xml:space="preserve">), Workload Identity habilitado, </w:t>
-      </w:r>
-      <w:r>
-        <w:rPr>
-          <w:rFonts w:ascii="Consolas" w:hAnsi="Consolas"/>
-          <w:color w:val="B03060"/>
-          <w:sz w:val="20"/>
-        </w:rPr>
-        <w:t>release_channel = REGULAR</w:t>
-      </w:r>
-      <w:r>
-        <w:t xml:space="preserve">, node pool con autoscaling (1-4 nodos </w:t>
-      </w:r>
-      <w:r>
-        <w:rPr>
-          <w:rFonts w:ascii="Consolas" w:hAnsi="Consolas"/>
-          <w:color w:val="B03060"/>
-          <w:sz w:val="20"/>
-        </w:rPr>
-        <w:t>e2-standard-4</w:t>
-      </w:r>
-      <w:r>
-        <w:t xml:space="preserve">). Artifact Registry para las imágenes. Los Deployments de </w:t>
-      </w:r>
-      <w:r>
-        <w:rPr>
-          <w:rFonts w:ascii="Consolas" w:hAnsi="Consolas"/>
-          <w:color w:val="B03060"/>
-          <w:sz w:val="20"/>
-        </w:rPr>
-        <w:t>service-a</w:t>
-      </w:r>
-      <w:r>
-        <w:t xml:space="preserve">, </w:t>
-      </w:r>
-      <w:r>
-        <w:rPr>
-          <w:rFonts w:ascii="Consolas" w:hAnsi="Consolas"/>
-          <w:color w:val="B03060"/>
-          <w:sz w:val="20"/>
-        </w:rPr>
-        <w:t>service-b</w:t>
-      </w:r>
-      <w:r>
-        <w:t xml:space="preserve"> y </w:t>
-      </w:r>
-      <w:r>
-        <w:rPr>
-          <w:rFonts w:ascii="Consolas" w:hAnsi="Consolas"/>
-          <w:color w:val="B03060"/>
-          <w:sz w:val="20"/>
-        </w:rPr>
-        <w:t>otel-collector</w:t>
-      </w:r>
-      <w:r>
-        <w:t xml:space="preserve"> se declaran con el provider </w:t>
-      </w:r>
-      <w:r>
-        <w:rPr>
-          <w:rFonts w:ascii="Consolas" w:hAnsi="Consolas"/>
-          <w:color w:val="B03060"/>
-          <w:sz w:val="20"/>
-        </w:rPr>
-        <w:t>kubernetes</w:t>
-      </w:r>
-      <w:r>
-        <w:t xml:space="preserve"> de Terraform, encadenado a los outputs del propio clúster (mismo archivo, sin </w:t>
-      </w:r>
-      <w:r>
-        <w:rPr>
-          <w:i/>
-        </w:rPr>
-        <w:t>hand-off</w:t>
-      </w:r>
-      <w:r>
-        <w:t xml:space="preserve"> manual a </w:t>
-      </w:r>
-      <w:r>
-        <w:rPr>
-          <w:rFonts w:ascii="Consolas" w:hAnsi="Consolas"/>
-          <w:color w:val="B03060"/>
-          <w:sz w:val="20"/>
-        </w:rPr>
-        <w:t>kubectl</w:t>
-      </w:r>
-      <w:r>
-        <w:t xml:space="preserve">). Credenciales de base de datos vía </w:t>
-      </w:r>
-      <w:r>
-        <w:rPr>
-          <w:rFonts w:ascii="Consolas" w:hAnsi="Consolas"/>
-          <w:color w:val="B03060"/>
-          <w:sz w:val="20"/>
-        </w:rPr>
-        <w:t>kubernetes_secret</w:t>
-      </w:r>
-      <w:r>
-        <w:t>, nunca en texto plano en el Deployment.</w:t>
-      </w:r>
-    </w:p>
-    <w:p>
-      <w:pPr>
-        <w:pStyle w:val="Heading2"/>
-      </w:pPr>
-      <w:r>
-        <w:t>7.3 AWS — ECS Fargate (</w:t>
-      </w:r>
-      <w:r>
-        <w:rPr>
-          <w:rFonts w:ascii="Consolas" w:hAnsi="Consolas"/>
-          <w:color w:val="B03060"/>
-          <w:sz w:val="20"/>
-        </w:rPr>
-        <w:t>iac/terraform/aws/</w:t>
-      </w:r>
-      <w:r>
-        <w:t>)</w:t>
-      </w:r>
-    </w:p>
-    <w:p>
-      <w:r>
-        <w:t xml:space="preserve">VPC mínima de 2 AZs, ECR por servicio, cluster ECS Fargate con Container Insights, ALB público hacia </w:t>
-      </w:r>
-      <w:r>
-        <w:rPr>
-          <w:rFonts w:ascii="Consolas" w:hAnsi="Consolas"/>
-          <w:color w:val="B03060"/>
-          <w:sz w:val="20"/>
-        </w:rPr>
-        <w:t>service-a:8000</w:t>
-      </w:r>
-      <w:r>
-        <w:t xml:space="preserve"> con healthcheck en </w:t>
-      </w:r>
-      <w:r>
-        <w:rPr>
-          <w:rFonts w:ascii="Consolas" w:hAnsi="Consolas"/>
-          <w:color w:val="B03060"/>
-          <w:sz w:val="20"/>
-        </w:rPr>
-        <w:t>/health</w:t>
-      </w:r>
-      <w:r>
-        <w:t xml:space="preserve">. El OTel Collector corre como </w:t>
-      </w:r>
-      <w:r>
-        <w:rPr>
-          <w:b/>
-        </w:rPr>
-        <w:t>sidecar</w:t>
-      </w:r>
-      <w:r>
-        <w:t xml:space="preserve"> dentro de cada task definition (en vez de un servicio ECS propio con Service Connect) — trade-off documentado en el propio </w:t>
-      </w:r>
-      <w:r>
-        <w:rPr>
-          <w:rFonts w:ascii="Consolas" w:hAnsi="Consolas"/>
-          <w:color w:val="B03060"/>
-          <w:sz w:val="20"/>
-        </w:rPr>
-        <w:t>main.tf</w:t>
-      </w:r>
-      <w:r>
-        <w:t xml:space="preserve">: más simple para un laboratorio (sin descubrimiento de servicios adicional, exportación por </w:t>
-      </w:r>
-      <w:r>
-        <w:rPr>
-          <w:rFonts w:ascii="Consolas" w:hAnsi="Consolas"/>
-          <w:color w:val="B03060"/>
-          <w:sz w:val="20"/>
-        </w:rPr>
-        <w:t>localhost</w:t>
-      </w:r>
-      <w:r>
-        <w:t xml:space="preserve">), a costa de correr N procesos Collector en vez de uno compartido; a mayor escala, un Collector compartido sería la elección correcta. </w:t>
-      </w:r>
-      <w:r>
-        <w:rPr>
-          <w:rFonts w:ascii="Consolas" w:hAnsi="Consolas"/>
-          <w:color w:val="B03060"/>
-          <w:sz w:val="20"/>
-        </w:rPr>
-        <w:t>service-b</w:t>
-      </w:r>
-      <w:r>
-        <w:t xml:space="preserve"> se descubre vía Cloud Map (</w:t>
-      </w:r>
-      <w:r>
-        <w:rPr>
-          <w:rFonts w:ascii="Consolas" w:hAnsi="Consolas"/>
-          <w:color w:val="B03060"/>
-          <w:sz w:val="20"/>
-        </w:rPr>
-        <w:t>service-b.&lt;namespace&gt;.local</w:t>
-      </w:r>
-      <w:r>
-        <w:t xml:space="preserve">). </w:t>
-      </w:r>
-      <w:r>
-        <w:rPr>
-          <w:rFonts w:ascii="Consolas" w:hAnsi="Consolas"/>
-          <w:color w:val="B03060"/>
-          <w:sz w:val="20"/>
-        </w:rPr>
-        <w:t>DATABASE_URL</w:t>
-      </w:r>
-      <w:r>
-        <w:t xml:space="preserve"> viaja vía AWS Secrets Manager (</w:t>
-      </w:r>
-      <w:r>
-        <w:rPr>
-          <w:rFonts w:ascii="Consolas" w:hAnsi="Consolas"/>
-          <w:color w:val="B03060"/>
-          <w:sz w:val="20"/>
-        </w:rPr>
-        <w:t>secrets</w:t>
-      </w:r>
-      <w:r>
-        <w:t xml:space="preserve"> de la task definition), con un fallback de variable plana solo para demo.</w:t>
-      </w:r>
-    </w:p>
-    <w:p>
-      <w:pPr>
-        <w:pStyle w:val="Heading2"/>
-      </w:pPr>
-      <w:r>
-        <w:t>7.4 Helm (</w:t>
-      </w:r>
-      <w:r>
-        <w:rPr>
-          <w:rFonts w:ascii="Consolas" w:hAnsi="Consolas"/>
-          <w:color w:val="B03060"/>
-          <w:sz w:val="20"/>
-        </w:rPr>
-        <w:t>iac/helm/otel-collector/</w:t>
-      </w:r>
-      <w:r>
-        <w:t>)</w:t>
-      </w:r>
-    </w:p>
-    <w:p>
-      <w:r>
-        <w:t xml:space="preserve">Chart propio (no el chart comunitario de </w:t>
-      </w:r>
-      <w:r>
-        <w:rPr>
-          <w:rFonts w:ascii="Consolas" w:hAnsi="Consolas"/>
-          <w:color w:val="B03060"/>
-          <w:sz w:val="20"/>
-        </w:rPr>
-        <w:t>open-telemetry/opentelemetry-helm-charts</w:t>
-      </w:r>
-      <w:r>
-        <w:t xml:space="preserve">, para demostrar comprensión del recurso, no solo su consumo) con Deployment + Service + ConfigMap parametrizados vía </w:t>
-      </w:r>
-      <w:r>
-        <w:rPr>
-          <w:rFonts w:ascii="Consolas" w:hAnsi="Consolas"/>
-          <w:color w:val="B03060"/>
-          <w:sz w:val="20"/>
-        </w:rPr>
-        <w:t>values.yaml</w:t>
-      </w:r>
-      <w:r>
-        <w:t xml:space="preserve"> — misma forma de pipeline (</w:t>
-      </w:r>
-      <w:r>
-        <w:rPr>
-          <w:rFonts w:ascii="Consolas" w:hAnsi="Consolas"/>
-          <w:color w:val="B03060"/>
-          <w:sz w:val="20"/>
-        </w:rPr>
-        <w:t>otlp</w:t>
-      </w:r>
-      <w:r>
-        <w:t xml:space="preserve"> → </w:t>
-      </w:r>
-      <w:r>
-        <w:rPr>
-          <w:rFonts w:ascii="Consolas" w:hAnsi="Consolas"/>
-          <w:color w:val="B03060"/>
-          <w:sz w:val="20"/>
-        </w:rPr>
-        <w:t>memory_limiter</w:t>
-      </w:r>
-      <w:r>
-        <w:t>/</w:t>
-      </w:r>
-      <w:r>
-        <w:rPr>
-          <w:rFonts w:ascii="Consolas" w:hAnsi="Consolas"/>
-          <w:color w:val="B03060"/>
-          <w:sz w:val="20"/>
-        </w:rPr>
-        <w:t>batch</w:t>
-      </w:r>
-      <w:r>
-        <w:t>/</w:t>
-      </w:r>
-      <w:r>
-        <w:rPr>
-          <w:rFonts w:ascii="Consolas" w:hAnsi="Consolas"/>
-          <w:color w:val="B03060"/>
-          <w:sz w:val="20"/>
-        </w:rPr>
-        <w:t>resource</w:t>
-      </w:r>
-      <w:r>
-        <w:t xml:space="preserve"> → exporters) que la variante local, pero con exporters dejados como placeholders para que cada entorno los sobrescriba sin tocar el chart. Validado con </w:t>
-      </w:r>
-      <w:r>
-        <w:rPr>
-          <w:rFonts w:ascii="Consolas" w:hAnsi="Consolas"/>
-          <w:color w:val="B03060"/>
-          <w:sz w:val="20"/>
-        </w:rPr>
-        <w:t>helm lint</w:t>
-      </w:r>
-      <w:r>
-        <w:t xml:space="preserve"> y </w:t>
-      </w:r>
-      <w:r>
-        <w:rPr>
-          <w:rFonts w:ascii="Consolas" w:hAnsi="Consolas"/>
-          <w:color w:val="B03060"/>
-          <w:sz w:val="20"/>
-        </w:rPr>
-        <w:t>helm template</w:t>
-      </w:r>
-      <w:r>
-        <w:t xml:space="preserve"> (sin clúster real disponible en este entorno de desarrollo).</w:t>
-      </w:r>
-    </w:p>
-    <w:p>
-      <w:pPr>
-        <w:pStyle w:val="Heading1"/>
-      </w:pPr>
-      <w:r>
-        <w:t>8. Lecciones aprendidas (troubleshooting real)</w:t>
-      </w:r>
-    </w:p>
-    <w:p>
-      <w:r>
-        <w:t>Tres problemas de instrumentación reales aparecieron solo al ejecutar el sistema, no al leer la documentación de OTel — se documentan porque son justamente el tipo de conocimiento que un ejercicio puramente teórico no puede enseñar.</w:t>
-      </w:r>
-    </w:p>
-    <w:p>
-      <w:r>
-        <w:rPr>
-          <w:b/>
-        </w:rPr>
-        <w:t>1. `FastAPIInstrumentor().instrument()` global no propagaba el trace_id.</w:t>
-      </w:r>
-      <w:r>
-        <w:t xml:space="preserve"> El patrón "instrumentar antes de crear la app" (llamar </w:t>
-      </w:r>
-      <w:r>
-        <w:rPr>
-          <w:rFonts w:ascii="Consolas" w:hAnsi="Consolas"/>
-          <w:color w:val="B03060"/>
-          <w:sz w:val="20"/>
-        </w:rPr>
-        <w:t>FastAPIInstrumentor().instrument(tracer_provider=...)</w:t>
-      </w:r>
-      <w:r>
-        <w:t xml:space="preserve"> sin argumento </w:t>
-      </w:r>
-      <w:r>
-        <w:rPr>
-          <w:rFonts w:ascii="Consolas" w:hAnsi="Consolas"/>
-          <w:color w:val="B03060"/>
-          <w:sz w:val="20"/>
-        </w:rPr>
-        <w:t>app</w:t>
-      </w:r>
-      <w:r>
-        <w:t xml:space="preserve">, confiando en que parchea </w:t>
-      </w:r>
-      <w:r>
-        <w:rPr>
-          <w:rFonts w:ascii="Consolas" w:hAnsi="Consolas"/>
-          <w:color w:val="B03060"/>
-          <w:sz w:val="20"/>
-        </w:rPr>
-        <w:t>FastAPI.__init__</w:t>
-      </w:r>
-      <w:r>
-        <w:t xml:space="preserve"> globalmente) resultó poco fiable en la práctica: cada span de negocio (</w:t>
-      </w:r>
-      <w:r>
-        <w:rPr>
-          <w:rFonts w:ascii="Consolas" w:hAnsi="Consolas"/>
-          <w:color w:val="B03060"/>
-          <w:sz w:val="20"/>
-        </w:rPr>
-        <w:t>order.fetch_from_db</w:t>
-      </w:r>
-      <w:r>
-        <w:t xml:space="preserve">, </w:t>
-      </w:r>
-      <w:r>
-        <w:rPr>
-          <w:rFonts w:ascii="Consolas" w:hAnsi="Consolas"/>
-          <w:color w:val="B03060"/>
-          <w:sz w:val="20"/>
-        </w:rPr>
-        <w:t>order.check_inventory</w:t>
-      </w:r>
-      <w:r>
-        <w:t xml:space="preserve">) terminaba como </w:t>
-      </w:r>
-      <w:r>
-        <w:rPr>
-          <w:i/>
-        </w:rPr>
-        <w:t>raíz</w:t>
-      </w:r>
-      <w:r>
-        <w:t xml:space="preserve"> de su propio trace en vez de colgar del span del servidor HTTP, y </w:t>
-      </w:r>
-      <w:r>
-        <w:rPr>
-          <w:rFonts w:ascii="Consolas" w:hAnsi="Consolas"/>
-          <w:color w:val="B03060"/>
-          <w:sz w:val="20"/>
-        </w:rPr>
-        <w:t>trace_id</w:t>
-      </w:r>
-      <w:r>
-        <w:t xml:space="preserve"> en la respuesta JSON salía en </w:t>
-      </w:r>
-      <w:r>
-        <w:rPr>
-          <w:rFonts w:ascii="Consolas" w:hAnsi="Consolas"/>
-          <w:color w:val="B03060"/>
-          <w:sz w:val="20"/>
-        </w:rPr>
-        <w:t>00000000000000000000000000000000</w:t>
-      </w:r>
-      <w:r>
-        <w:t xml:space="preserve"> (span inválido). La corrección fue usar el patrón explícito </w:t>
-      </w:r>
-      <w:r>
-        <w:rPr>
-          <w:rFonts w:ascii="Consolas" w:hAnsi="Consolas"/>
-          <w:color w:val="B03060"/>
-          <w:sz w:val="20"/>
-        </w:rPr>
-        <w:t>FastAPIInstrumentor.instrument_app(app, ...)</w:t>
-      </w:r>
-      <w:r>
-        <w:t xml:space="preserve"> justo después de </w:t>
-      </w:r>
-      <w:r>
-        <w:rPr>
-          <w:rFonts w:ascii="Consolas" w:hAnsi="Consolas"/>
-          <w:color w:val="B03060"/>
-          <w:sz w:val="20"/>
-        </w:rPr>
-        <w:t>app = FastAPI(...)</w:t>
-      </w:r>
-      <w:r>
-        <w:t xml:space="preserve"> en </w:t>
-      </w:r>
-      <w:r>
-        <w:rPr>
-          <w:rFonts w:ascii="Consolas" w:hAnsi="Consolas"/>
-          <w:color w:val="B03060"/>
-          <w:sz w:val="20"/>
-        </w:rPr>
-        <w:t>main.py</w:t>
-      </w:r>
-      <w:r>
-        <w:t xml:space="preserve"> — documentado con un comentario en </w:t>
-      </w:r>
-      <w:r>
-        <w:rPr>
-          <w:rFonts w:ascii="Consolas" w:hAnsi="Consolas"/>
-          <w:color w:val="B03060"/>
-          <w:sz w:val="20"/>
-        </w:rPr>
-        <w:t>telemetry.py</w:t>
-      </w:r>
-      <w:r>
-        <w:t xml:space="preserve"> para que no se repita el error.</w:t>
-      </w:r>
-    </w:p>
-    <w:p>
-      <w:r>
-        <w:rPr>
-          <w:b/>
-        </w:rPr>
-        <w:t>2. El filtro de `/health` en el Collector no bastaba.</w:t>
-      </w:r>
-      <w:r>
-        <w:t xml:space="preserve"> El middleware ASGI de FastAPI genera spans internos por cada evento (</w:t>
-      </w:r>
-      <w:r>
-        <w:rPr>
-          <w:rFonts w:ascii="Consolas" w:hAnsi="Consolas"/>
-          <w:color w:val="B03060"/>
-          <w:sz w:val="20"/>
-        </w:rPr>
-        <w:t>http send</w:t>
-      </w:r>
-      <w:r>
-        <w:t xml:space="preserve">, </w:t>
-      </w:r>
-      <w:r>
-        <w:rPr>
-          <w:rFonts w:ascii="Consolas" w:hAnsi="Consolas"/>
-          <w:color w:val="B03060"/>
-          <w:sz w:val="20"/>
-        </w:rPr>
-        <w:t>http receive</w:t>
-      </w:r>
-      <w:r>
-        <w:t xml:space="preserve">) además del span raíz del endpoint. El processor </w:t>
-      </w:r>
-      <w:r>
-        <w:rPr>
-          <w:rFonts w:ascii="Consolas" w:hAnsi="Consolas"/>
-          <w:color w:val="B03060"/>
-          <w:sz w:val="20"/>
-        </w:rPr>
-        <w:t>filter/health</w:t>
-      </w:r>
-      <w:r>
-        <w:t xml:space="preserve"> del Collector (que descarta por el atributo </w:t>
-      </w:r>
-      <w:r>
-        <w:rPr>
-          <w:rFonts w:ascii="Consolas" w:hAnsi="Consolas"/>
-          <w:color w:val="B03060"/>
-          <w:sz w:val="20"/>
-        </w:rPr>
-        <w:t>http.target == "/health"</w:t>
-      </w:r>
-      <w:r>
-        <w:t xml:space="preserve">) solo alcanza al span raíz — los spans internos de evento no llevan ese atributo, así que igual llegaban a Jaeger como trazas huérfanas (con </w:t>
-      </w:r>
-      <w:r>
-        <w:rPr>
-          <w:rFonts w:ascii="Consolas" w:hAnsi="Consolas"/>
-          <w:color w:val="B03060"/>
-          <w:sz w:val="20"/>
-        </w:rPr>
-        <w:t>trace_id</w:t>
-      </w:r>
-      <w:r>
-        <w:t xml:space="preserve"> propio, sin span padre visible). La solución correcta es evitar que esos spans se </w:t>
-      </w:r>
-      <w:r>
-        <w:rPr>
-          <w:b/>
-        </w:rPr>
-        <w:t>creen</w:t>
-      </w:r>
-      <w:r>
-        <w:t xml:space="preserve">, no filtrarlos después: </w:t>
-      </w:r>
-      <w:r>
-        <w:rPr>
-          <w:rFonts w:ascii="Consolas" w:hAnsi="Consolas"/>
-          <w:color w:val="B03060"/>
-          <w:sz w:val="20"/>
-        </w:rPr>
-        <w:t>FastAPIInstrumentor.instrument_app(app, excluded_urls="/health", ...)</w:t>
-      </w:r>
-      <w:r>
-        <w:t xml:space="preserve">. El processor </w:t>
-      </w:r>
-      <w:r>
-        <w:rPr>
-          <w:rFonts w:ascii="Consolas" w:hAnsi="Consolas"/>
-          <w:color w:val="B03060"/>
-          <w:sz w:val="20"/>
-        </w:rPr>
-        <w:t>filter/health</w:t>
-      </w:r>
-      <w:r>
-        <w:t xml:space="preserve"> del Collector se dejó como segunda capa de defensa (para servicios que no puedan excluir por SDK), pero ya no es la única línea de defensa.</w:t>
-      </w:r>
-    </w:p>
-    <w:p>
-      <w:r>
-        <w:rPr>
-          <w:b/>
-        </w:rPr>
-        <w:t>3. Los histogramas de latencia daban un p95 fantasma de ~4.75 segundos.</w:t>
-      </w:r>
-      <w:r>
-        <w:t xml:space="preserve"> Al poblar el dashboard con tráfico real, el panel "Latencia p95" mostraba consistentemente ~4750ms, aunque una petición manual cronometrada tardaba 43ms. Causa: </w:t>
-      </w:r>
-      <w:r>
-        <w:rPr>
-          <w:rFonts w:ascii="Consolas" w:hAnsi="Consolas"/>
-          <w:color w:val="B03060"/>
-          <w:sz w:val="20"/>
-        </w:rPr>
-        <w:t>meter.create_histogram(...)</w:t>
-      </w:r>
-      <w:r>
-        <w:t xml:space="preserve"> se llamó sin especificar </w:t>
-      </w:r>
-      <w:r>
-        <w:rPr>
-          <w:i/>
-        </w:rPr>
-        <w:t>bucket boundaries</w:t>
-      </w:r>
-      <w:r>
-        <w:t xml:space="preserve"> explícitos, así que el SDK usa los valores por defecto </w:t>
-      </w:r>
-      <w:r>
-        <w:rPr>
-          <w:rFonts w:ascii="Consolas" w:hAnsi="Consolas"/>
-          <w:color w:val="B03060"/>
-          <w:sz w:val="20"/>
-        </w:rPr>
-        <w:t>(0, 5, 10, 25, 50, 75, 100, 250, 500, 750, 1000, 2500, 5000, 7500, 10000)</w:t>
-      </w:r>
-      <w:r>
-        <w:t xml:space="preserve"> — pensados para mediciones en </w:t>
-      </w:r>
-      <w:r>
-        <w:rPr>
-          <w:b/>
-        </w:rPr>
-        <w:t>milisegundos</w:t>
-      </w:r>
-      <w:r>
-        <w:t xml:space="preserve">. Pero el código mide en </w:t>
-      </w:r>
-      <w:r>
-        <w:rPr>
-          <w:b/>
-        </w:rPr>
-        <w:t>segundos</w:t>
-      </w:r>
-      <w:r>
-        <w:t xml:space="preserve"> (</w:t>
-      </w:r>
-      <w:r>
-        <w:rPr>
-          <w:rFonts w:ascii="Consolas" w:hAnsi="Consolas"/>
-          <w:color w:val="B03060"/>
-          <w:sz w:val="20"/>
-        </w:rPr>
-        <w:t>duration = time.time() - start</w:t>
-      </w:r>
-      <w:r>
-        <w:t xml:space="preserve">, valores como </w:t>
-      </w:r>
-      <w:r>
-        <w:rPr>
-          <w:rFonts w:ascii="Consolas" w:hAnsi="Consolas"/>
-          <w:color w:val="B03060"/>
-          <w:sz w:val="20"/>
-        </w:rPr>
-        <w:t>0.043</w:t>
-      </w:r>
-      <w:r>
-        <w:t>), así que absolutamente todas las observaciones caían en el primer bucket no vacío (</w:t>
-      </w:r>
-      <w:r>
-        <w:rPr>
-          <w:rFonts w:ascii="Consolas" w:hAnsi="Consolas"/>
-          <w:color w:val="B03060"/>
-          <w:sz w:val="20"/>
-        </w:rPr>
-        <w:t>le=5.0</w:t>
-      </w:r>
-      <w:r>
-        <w:t xml:space="preserve">, es decir, "≤ 5 segundos") sin ningún bucket intermedio que las distinguiera. Con un único escalón informativo, </w:t>
-      </w:r>
-      <w:r>
-        <w:rPr>
-          <w:rFonts w:ascii="Consolas" w:hAnsi="Consolas"/>
-          <w:color w:val="B03060"/>
-          <w:sz w:val="20"/>
-        </w:rPr>
-        <w:t>histogram_quantile</w:t>
-      </w:r>
-      <w:r>
-        <w:t xml:space="preserve"> interpola linealmente entre 0 y 5.0 para estimar el percentil 95, dando ~4.75 — un artefacto matemático, no una medición real. Verificado inspeccionando los buckets crudos vía la API de Prometheus (</w:t>
-      </w:r>
-      <w:r>
-        <w:rPr>
-          <w:rFonts w:ascii="Consolas" w:hAnsi="Consolas"/>
-          <w:color w:val="B03060"/>
-          <w:sz w:val="20"/>
-        </w:rPr>
-        <w:t>http_request_duration_seconds_bucket</w:t>
-      </w:r>
-      <w:r>
-        <w:t xml:space="preserve">): 691 observaciones repartidas en </w:t>
-      </w:r>
-      <w:r>
-        <w:rPr>
-          <w:rFonts w:ascii="Consolas" w:hAnsi="Consolas"/>
-          <w:color w:val="B03060"/>
-          <w:sz w:val="20"/>
-        </w:rPr>
-        <w:t>le=0.0 → 0</w:t>
-      </w:r>
-      <w:r>
-        <w:t xml:space="preserve"> y </w:t>
-      </w:r>
-      <w:r>
-        <w:rPr>
-          <w:rFonts w:ascii="Consolas" w:hAnsi="Consolas"/>
-          <w:color w:val="B03060"/>
-          <w:sz w:val="20"/>
-        </w:rPr>
-        <w:t>le=5.0 → 691</w:t>
-      </w:r>
-      <w:r>
-        <w:t>, sin nada entre medio.</w:t>
-      </w:r>
-    </w:p>
-    <w:p>
-      <w:r>
-        <w:t xml:space="preserve">La corrección fue registrar un </w:t>
-      </w:r>
-      <w:r>
-        <w:rPr>
-          <w:rFonts w:ascii="Consolas" w:hAnsi="Consolas"/>
-          <w:color w:val="B03060"/>
-          <w:sz w:val="20"/>
-        </w:rPr>
-        <w:t>View</w:t>
-      </w:r>
-      <w:r>
-        <w:t xml:space="preserve"> con </w:t>
-      </w:r>
-      <w:r>
-        <w:rPr>
-          <w:rFonts w:ascii="Consolas" w:hAnsi="Consolas"/>
-          <w:color w:val="B03060"/>
-          <w:sz w:val="20"/>
-        </w:rPr>
-        <w:t>ExplicitBucketHistogramAggregation</w:t>
-      </w:r>
-      <w:r>
-        <w:t xml:space="preserve"> sobre todos los instrumentos </w:t>
-      </w:r>
-      <w:r>
-        <w:rPr>
-          <w:rFonts w:ascii="Consolas" w:hAnsi="Consolas"/>
-          <w:color w:val="B03060"/>
-          <w:sz w:val="20"/>
-        </w:rPr>
-        <w:t>*_seconds</w:t>
-      </w:r>
-      <w:r>
-        <w:t>, con los boundaries clásicos de Prometheus en segundos (</w:t>
-      </w:r>
-      <w:r>
-        <w:rPr>
-          <w:rFonts w:ascii="Consolas" w:hAnsi="Consolas"/>
-          <w:color w:val="B03060"/>
-          <w:sz w:val="20"/>
-        </w:rPr>
-        <w:t>0.005, 0.01, 0.025, ..., 7.5, 10</w:t>
-      </w:r>
-      <w:r>
-        <w:t xml:space="preserve">) — ver </w:t>
-      </w:r>
-      <w:r>
-        <w:rPr>
-          <w:rFonts w:ascii="Consolas" w:hAnsi="Consolas"/>
-          <w:color w:val="B03060"/>
-          <w:sz w:val="20"/>
-        </w:rPr>
-        <w:t>services/*/app/telemetry.py</w:t>
-      </w:r>
-      <w:r>
-        <w:t>. Tras el fix, el mismo tráfico mostró 25 de 30 requests entre 25-50ms y un p95 real de ~48ms, coherente con la medición manual.</w:t>
-      </w:r>
-    </w:p>
-    <w:p>
-      <w:r>
-        <w:t xml:space="preserve">Este bug es fácil de cometer y fácil de no notar: el dashboard "funcionaba" (mostraba un número, con unidad, con color) — solo estaba mal. Es un recordatorio de que un panel con datos no es lo mismo que un panel con datos </w:t>
-      </w:r>
-      <w:r>
-        <w:rPr>
-          <w:i/>
-        </w:rPr>
-        <w:t>correctos</w:t>
-      </w:r>
-      <w:r>
-        <w:t>, y de que vale la pena cruzar al menos una vez el número que muestra un dashboard contra una medición manual independiente.</w:t>
-      </w:r>
-    </w:p>
-    <w:p>
-      <w:pPr>
-        <w:pStyle w:val="Heading1"/>
-      </w:pPr>
-      <w:r>
-        <w:t>9. Trabajo futuro</w:t>
-      </w:r>
-    </w:p>
-    <w:p>
-      <w:pPr>
-        <w:pStyle w:val="ListBullet"/>
-      </w:pPr>
-      <w:r>
-        <w:t xml:space="preserve">Migrar el acceso a PostgreSQL a </w:t>
-      </w:r>
-      <w:r>
-        <w:rPr>
-          <w:rFonts w:ascii="Consolas" w:hAnsi="Consolas"/>
-          <w:color w:val="B03060"/>
-          <w:sz w:val="20"/>
-        </w:rPr>
-        <w:t>asyncpg</w:t>
-      </w:r>
-      <w:r>
-        <w:t xml:space="preserve"> (o </w:t>
-      </w:r>
-      <w:r>
-        <w:rPr>
-          <w:rFonts w:ascii="Consolas" w:hAnsi="Consolas"/>
-          <w:color w:val="B03060"/>
-          <w:sz w:val="20"/>
-        </w:rPr>
-        <w:t>run_in_executor</w:t>
-      </w:r>
-      <w:r>
-        <w:t>) para eliminar el bloqueo del event loop identificado en 6.3 y repetir el benchmark — la hipótesis es que el overhead relativo de OTel bajaría a un solo dígito porcentual.</w:t>
-      </w:r>
-    </w:p>
-    <w:p>
-      <w:pPr>
-        <w:pStyle w:val="ListBullet"/>
-      </w:pPr>
-      <w:r>
-        <w:rPr>
-          <w:rFonts w:ascii="Consolas" w:hAnsi="Consolas"/>
-          <w:color w:val="B03060"/>
-          <w:sz w:val="20"/>
-        </w:rPr>
-        <w:t>tail_sampling</w:t>
-      </w:r>
-      <w:r>
-        <w:t xml:space="preserve"> en el Collector (muestrear el 100% de las trazas con error o latencia alta, y un porcentaje menor del resto) para reducir volumen sin perder señal, una vez el sistema tenga tráfico de producción real.</w:t>
-      </w:r>
-    </w:p>
-    <w:p>
-      <w:pPr>
-        <w:pStyle w:val="ListBullet"/>
-      </w:pPr>
-      <w:r>
-        <w:t>Ejecutar el benchmark en un entorno aislado (no una laptop de desarrollo compartida) y con múltiples repeticiones, para obtener intervalos de confianza sobre el overhead de CPU.</w:t>
+        <w:t xml:space="preserve"> desde el host), para no depender de dos corridas separadas como en 6.2.</w:t>
       </w:r>
     </w:p>
     <w:p>

</xml_diff>